<commit_message>
final report draft v3
</commit_message>
<xml_diff>
--- a/MX_Final_Report.docx
+++ b/MX_Final_Report.docx
@@ -293,7 +293,7 @@
           <w:sz w:val="21"/>
           <w:szCs w:val="21"/>
         </w:rPr>
-        <w:t xml:space="preserve">The direct consequence is that the storage precision of the wavefield is a lever on performance. Every bit removed from a stored value is a byte fraction that need not be moved, so a narrower representation translates into a faster solve, provided the loss of precision does not spoil the result. Reduced precision, and data compression more generally, has therefore drawn steady interest as a way to cut the cost of the solve (Virieux and Operto, 2009), most visibly through half precision, which halves storage against single precision and has been demonstrated on the elastic wave equation.</w:t>
+        <w:t xml:space="preserve">The direct consequence is that the storage precision of the wavefield is a lever on performance. Every bit removed from a stored value is a byte fraction that need not be moved, so a narrower representation translates into a faster solve, provided the loss of precision does not spoil the result. Reduced precision, and data compression more generally, has therefore drawn steady interest as a way to cut the cost of the solve, most visibly through half precision, which halves storage against single precision and has been demonstrated on the elastic wave equation.</w:t>
       </w:r>
     </w:p>
     <w:p>
@@ -589,7 +589,7 @@
           <w:sz w:val="21"/>
           <w:szCs w:val="21"/>
         </w:rPr>
-        <w:t xml:space="preserve">Experiments use the Marmousi velocity model (Versteeg, 1994) with a single source and a line of receivers along the surface. The solver is generated by Devito (Louboutin et al., 2019), which compiles a finite-difference operator from a symbolic statement of the wave equation. At each time step the operator advances the field in single precision, after which the wavefield is packed to microscaling and unpacked before the next step, so the format acts only on the stored state between steps. Devito cannot construct a half-precision grid, so the half-precision-arithmetic comparison of Section 5.3 is reproduced separately in a self-contained stepper. Accuracy sweeps use a cropped window of the model, which shortens each run and allows the many repetitions the sweeps require.</w:t>
+        <w:t xml:space="preserve">Experiments use the Marmousi velocity model (Versteeg, 1994) with a single source and a line of receivers along the surface. The solver is generated by Devito (Louboutin et al., 2019), which compiles a finite-difference operator from a symbolic statement of the wave equation. At each time step the operator advances the field in single precision, after which the wavefield is packed to microscaling and unpacked before the next step, so the format acts only on the stored state between steps. Devito cannot construct a half-precision grid, so the half-precision-arithmetic method of Fabien-Ouellet is reproduced separately in a self-contained stepper (Appendix C). Accuracy sweeps use a cropped window of the model, which shortens each run and allows the many repetitions the sweeps require.</w:t>
       </w:r>
     </w:p>
     <w:p>
@@ -637,6 +637,21 @@
           <w:szCs w:val="21"/>
         </w:rPr>
         <w:t xml:space="preserve">Efficiency is estimated from memory traffic rather than measured on the clock. The format is emulated, so timing would record the emulation and not the format, whereas the byte count is exact. Because the solver is bandwidth-bound the predicted speed-up is essentially the ratio of bytes moved, which is the quantity the model computes and which does not depend on the processor.</w:t>
+      </w:r>
+    </w:p>
+    <w:p>
+      <w:pPr>
+        <w:spacing w:after="60" w:before="60" w:line="300" w:lineRule="auto"/>
+        <w:jc w:val="left"/>
+      </w:pPr>
+      <w:r>
+        <w:rPr>
+          <w:rFonts w:ascii="Calibri" w:cs="Calibri" w:eastAsia="Calibri" w:hAnsi="Calibri"/>
+          <w:color w:val="111111"/>
+          <w:sz w:val="21"/>
+          <w:szCs w:val="21"/>
+        </w:rPr>
+        <w:t xml:space="preserve">With round-to-nearest the accuracy measurements are deterministic: repeating a run reproduces the reported error exactly, so no run-to-run error bars apply. The one measured quantity that does vary between runs is the wall-clock time of packing and unpacking in Section 5.6, which is reported as the fastest of several repeated batches to suppress scheduling noise.</w:t>
       </w:r>
     </w:p>
     <w:p>
@@ -2466,11 +2481,24 @@
       <w:r>
         <w:rPr>
           <w:rFonts w:ascii="Calibri" w:cs="Calibri" w:eastAsia="Calibri" w:hAnsi="Calibri"/>
-          <w:color w:val="111111"/>
-          <w:sz w:val="21"/>
-          <w:szCs w:val="21"/>
-        </w:rPr>
-        <w:t xml:space="preserve">Several limitations bound these claims. The efficiency is modelled, not measured, because the format is emulated; the system-level speed-up is capped near twofold while the model arrays remain uncompressed; the quantiser is a simplified block floating-point rather than the exact OCP standard, so published guidance on safe bit widths would require that standard; and the study is two-dimensional and single-shot on cropped models. Two smaller observations remain open: stochastic rounding did not improve on round-to-nearest, contrary to results for the parabolic heat equation (Croci and Giles, 2023), and the effect of quantising less frequently has not been swept. The block-size anomaly, by contrast, is now explained as a shape effect.</w:t>
+          <w:b/>
+          <w:bCs/>
+          <w:color w:val="111111"/>
+          <w:sz w:val="21"/>
+          <w:szCs w:val="21"/>
+        </w:rPr>
+        <w:t xml:space="preserve">The limitations fall into two kinds. </w:t>
+      </w:r>
+      <w:r>
+        <w:rPr>
+          <w:rFonts w:ascii="Calibri" w:cs="Calibri" w:eastAsia="Calibri" w:hAnsi="Calibri"/>
+          <w:b w:val="false"/>
+          <w:bCs w:val="false"/>
+          <w:color w:val="111111"/>
+          <w:sz w:val="21"/>
+          <w:szCs w:val="21"/>
+        </w:rPr>
+        <w:t xml:space="preserve">One is inherent to the method. The system-level speed-up is capped near twofold because only the wavefield is compressed while the model arrays are not, and error accumulation over time steps, shown in Section 5.4 to be the binding constraint, is a property of feeding a quantised field back into the solve rather than of the present implementation. The other kind is a limitation of this study, and could be lifted with more time. Efficiency is modelled rather than measured because the format is emulated; the quantiser is a simplified block floating-point rather than the exact OCP standard, so published guidance on safe bit widths would require that standard; and the experiments are two-dimensional and single-shot on cropped models. Two smaller questions were left open by the study: stochastic rounding did not improve on round-to-nearest, contrary to results for the parabolic heat equation (Croci and Giles, 2023), and the effect of quantising less frequently was not swept. The block-size anomaly, by contrast, is now explained as a shape effect.</w:t>
       </w:r>
     </w:p>
     <w:p>
@@ -2502,7 +2530,22 @@
           <w:sz w:val="21"/>
           <w:szCs w:val="21"/>
         </w:rPr>
-        <w:t xml:space="preserve">Microscaling block floating-point, applied as a storage layer to a finite-difference seismic solver, reaches a higher signal-to-noise ratio than half precision at fewer bits per stored value, on both the acoustic and elastic kernels, and the advantage survives when the direct arrival is removed and only the reflections are scored. The accuracy limit is set by error accumulation over time steps rather than by the format's single-frame error, and a square block is more accurate than the memory-ordered strip at the same cost. Taken together these establish microscaling storage as a practical means of reducing the memory traffic that governs solver speed.</w:t>
+        <w:t xml:space="preserve">The four objectives set out in Section 3 were all met. On the first, microscaling reached a higher signal-to-noise ratio than half precision at fewer bits per stored value, on both kernels: 49.5 dB against 44.2 dB at 14.25 bits on the acoustic kernel, and 61 dB against 55 dB, or 57 dB at only 13.25 bits, on the elastic kernel. On the second, that advantage survived the stricter reflection-only measure: the ratio fell by about eight decibels once the direct arrival was removed, but the ranking of the schemes was unchanged and microscaling still cleared a 40 dB target at twelve mantissa bits. On the third, the accuracy limit was shown to come from error accumulation over time steps rather than from the format's single-frame error, which a single compress-and-decompress preserves to about 78 dB while the full solve amplifies it a hundredfold or more. On the fourth, block shape was found to affect accuracy at fixed cost, a square block beating the memory-ordered strip by 4.6 dB, while adding only a 1.1 to 1.2 times pack-and-unpack overhead that is negligible in a bandwidth-bound solver.</w:t>
+      </w:r>
+    </w:p>
+    <w:p>
+      <w:pPr>
+        <w:spacing w:after="60" w:before="60" w:line="300" w:lineRule="auto"/>
+        <w:jc w:val="left"/>
+      </w:pPr>
+      <w:r>
+        <w:rPr>
+          <w:rFonts w:ascii="Calibri" w:cs="Calibri" w:eastAsia="Calibri" w:hAnsi="Calibri"/>
+          <w:color w:val="111111"/>
+          <w:sz w:val="21"/>
+          <w:szCs w:val="21"/>
+        </w:rPr>
+        <w:t xml:space="preserve">Taken together these establish microscaling storage as a practical means of reducing the memory traffic that governs solver speed, more accurate per stored bit than the half-precision baseline in current use, and understood well enough to say where its limit lies and how its blocks should be arranged.</w:t>
       </w:r>
     </w:p>
     <w:p>

</xml_diff>

<commit_message>
final report draft v4, time scaling SNR
</commit_message>
<xml_diff>
--- a/MX_Final_Report.docx
+++ b/MX_Final_Report.docx
@@ -246,7 +246,7 @@
           <w:sz w:val="21"/>
           <w:szCs w:val="21"/>
         </w:rPr>
-        <w:t xml:space="preserve">Finite-difference solvers for seismic wave propagation are limited by memory bandwidth rather than by arithmetic, so the number of bits used to store the wavefield sets how fast they run. This project asks whether microscaling, a block floating-point storage format from machine learning in which a group of values shares one exponent, carries the same benefit to seismic wave modelling. It was implemented as a storage layer around a full-precision finite-difference solver on Marmousi, with the wavefield packed to microscaling and unpacked each step while the arithmetic stayed in single precision. Accuracy was the signal-to-noise ratio of the shot record against a full-precision reference, and efficiency was estimated from memory traffic. At about fourteen bits per value microscaling reached a higher signal-to-noise ratio than half precision at sixteen bits, on both acoustic and elastic kernels, and the advantage held when only the reflections were scored. Further tests showed the accuracy limit comes from error accumulation over time rather than from the format, and that a square block beats the memory-ordered strip at equal cost. Microscaling storage is thus a practical route to lower memory traffic in wave modelling, with larger gains once the model arrays are compressed too.</w:t>
+        <w:t xml:space="preserve">Finite-difference seismic solvers are limited by memory bandwidth rather than arithmetic, so the number of bits used to store the wavefield sets how fast they run. This project asks whether microscaling, a block floating-point storage format from machine learning in which a group of values shares one exponent, carries the same benefit to seismic modelling. It was implemented as a storage layer around a full-precision finite-difference solver on Marmousi, with the wavefield packed to microscaling and unpacked each step while the arithmetic stayed in single precision. Accuracy was the signal-to-noise ratio of the shot record against a full-precision reference, time-scaled to weight the arrivals evenly, and efficiency was estimated from memory traffic. At about fourteen bits per value microscaling reached a higher signal-to-noise ratio than half precision at sixteen bits, on both acoustic and elastic kernels, and held when only the reflections were scored. Further tests showed the accuracy limit comes from error accumulation over time rather than from the format, and that a square block beats the memory-ordered strip at equal cost. Microscaling storage is thus a practical route to lower memory traffic in wave modelling, with larger gains once the model arrays are compressed too.</w:t>
       </w:r>
     </w:p>
     <w:p>
@@ -621,7 +621,22 @@
           <w:sz w:val="21"/>
           <w:szCs w:val="21"/>
         </w:rPr>
-        <w:t xml:space="preserve">Accuracy is the relative error of the shot record against a full-precision run through the same driver, reported as a signal-to-noise ratio in decibels, defined as minus twenty times the base-ten logarithm of that relative error. Higher is better and a tenfold reduction in error is twenty decibels. A reference point frames the scale: single precision itself departs from double precision by about 9x10^-4 on the full model, so a setting that reaches this level is as accurate as the precision in production use. The global ratio is dominated by the strong direct arrival; Section 5.5 introduces a reflection-only measure that removes it.</w:t>
+        <w:t xml:space="preserve">Accuracy is the relative error of the shot record against a full-precision run through the same driver, reported as a signal-to-noise ratio in decibels, minus twenty times the base-ten logarithm of that relative error. Higher is better and a tenfold reduction in error is twenty decibels. A plain error of this kind is dominated by the strong early arrivals, because they carry most of the record's energy, so it mainly measures how well the top of the record is preserved and barely reflects the weak late arrivals that make up the image. To weight the arrivals evenly, both records are multiplied by a gain that grows linearly with time, the standard correction for geometric spreading, before the error is formed; this lifts the weak deep events to a comparable weight so the metric scores the whole record rather than favouring its strongest part. Every signal-to-noise figure quoted below is this time-scaled measure.</w:t>
+      </w:r>
+    </w:p>
+    <w:p>
+      <w:pPr>
+        <w:spacing w:after="60" w:before="60" w:line="300" w:lineRule="auto"/>
+        <w:jc w:val="left"/>
+      </w:pPr>
+      <w:r>
+        <w:rPr>
+          <w:rFonts w:ascii="Calibri" w:cs="Calibri" w:eastAsia="Calibri" w:hAnsi="Calibri"/>
+          <w:color w:val="111111"/>
+          <w:sz w:val="21"/>
+          <w:szCs w:val="21"/>
+        </w:rPr>
+        <w:t xml:space="preserve">A reference point frames the scale: single precision itself departs from double precision by about 9x10^-4 on the full model. Section 5.5 gives a second, independent check on the same concern, removing the direct arrival physically with a water model rather than down-weighting it.</w:t>
       </w:r>
     </w:p>
     <w:p>
@@ -748,7 +763,7 @@
           <w:sz w:val="17"/>
           <w:szCs w:val="17"/>
         </w:rPr>
-        <w:t xml:space="preserve">Figure 1. Cost against accuracy for every scheme on the cropped Marmousi acoustic model. Lower and further left is better; the right axis is the signal-to-noise ratio in decibels.</w:t>
+        <w:t xml:space="preserve">Figure 1. Cost against accuracy for every scheme on the cropped Marmousi acoustic model. Lower and further left is better; the right axis is the time-scaled signal-to-noise ratio in decibels.</w:t>
       </w:r>
     </w:p>
     <w:p>
@@ -776,7 +791,7 @@
           <w:sz w:val="21"/>
           <w:szCs w:val="21"/>
         </w:rPr>
-        <w:t xml:space="preserve">Microscaling reaches 3.4x10^-3 error, or 49.5 dB, at 14.25 bits per value, against 6.1x10^-3, or 44.2 dB, for half precision with scaling at sixteen bits (Table 1).</w:t>
+        <w:t xml:space="preserve">Microscaling reaches 4.1x10^-3 error, or 47.8 dB, at 14.25 bits per value, against 8.2x10^-3, or 41.7 dB, for half precision with scaling at sixteen bits (Table 1).</w:t>
       </w:r>
       <w:r>
         <w:rPr>
@@ -787,7 +802,7 @@
           <w:sz w:val="21"/>
           <w:szCs w:val="21"/>
         </w:rPr>
-        <w:t xml:space="preserve"> It is more accurate while storing fewer bits, and the same holds against bfloat16, whose wide exponent range is wasted on a field that needs precision, not range. The single global fixed-point scale of int16 does worse still, for reasons taken up in the discussion.</w:t>
+        <w:t xml:space="preserve"> It is more accurate while storing fewer bits, and by a wider margin than a plain error would suggest, because the time-scaled metric rewards the weak late arrivals that microscaling preserves better than the alternatives. The same holds against bfloat16, whose wide exponent range is wasted on a field that needs precision, not range, and against int16, whose single global fixed-point scale does worse still, for reasons taken up in the discussion.</w:t>
       </w:r>
     </w:p>
     <w:p>
@@ -803,7 +818,7 @@
           <w:sz w:val="17"/>
           <w:szCs w:val="17"/>
         </w:rPr>
-        <w:t xml:space="preserve">Table 1. Accuracy and cost on the acoustic kernel; the signal-to-noise ratio is the primary column.</w:t>
+        <w:t xml:space="preserve">Table 1. Accuracy and cost on the acoustic kernel; the time-scaled signal-to-noise ratio is the primary column.</w:t>
       </w:r>
     </w:p>
     <w:tbl>
@@ -1026,7 +1041,7 @@
                 <w:sz w:val="18"/>
                 <w:szCs w:val="18"/>
               </w:rPr>
-              <w:t xml:space="preserve">91.6</w:t>
+              <w:t xml:space="preserve">87.7</w:t>
             </w:r>
           </w:p>
         </w:tc>
@@ -1055,7 +1070,7 @@
                 <w:sz w:val="18"/>
                 <w:szCs w:val="18"/>
               </w:rPr>
-              <w:t xml:space="preserve">2.6x10^-5</w:t>
+              <w:t xml:space="preserve">4.1x10^-5</w:t>
             </w:r>
           </w:p>
         </w:tc>
@@ -1144,7 +1159,7 @@
                 <w:sz w:val="18"/>
                 <w:szCs w:val="18"/>
               </w:rPr>
-              <w:t xml:space="preserve">44.2</w:t>
+              <w:t xml:space="preserve">41.7</w:t>
             </w:r>
           </w:p>
         </w:tc>
@@ -1173,7 +1188,7 @@
                 <w:sz w:val="18"/>
                 <w:szCs w:val="18"/>
               </w:rPr>
-              <w:t xml:space="preserve">6.1x10^-3</w:t>
+              <w:t xml:space="preserve">8.2x10^-3</w:t>
             </w:r>
           </w:p>
         </w:tc>
@@ -1262,7 +1277,7 @@
                 <w:sz w:val="18"/>
                 <w:szCs w:val="18"/>
               </w:rPr>
-              <w:t xml:space="preserve">41.8</w:t>
+              <w:t xml:space="preserve">37.2</w:t>
             </w:r>
           </w:p>
         </w:tc>
@@ -1291,7 +1306,7 @@
                 <w:sz w:val="18"/>
                 <w:szCs w:val="18"/>
               </w:rPr>
-              <w:t xml:space="preserve">8.1x10^-3</w:t>
+              <w:t xml:space="preserve">1.4x10^-2</w:t>
             </w:r>
           </w:p>
         </w:tc>
@@ -1380,7 +1395,7 @@
                 <w:sz w:val="18"/>
                 <w:szCs w:val="18"/>
               </w:rPr>
-              <w:t xml:space="preserve">24.2</w:t>
+              <w:t xml:space="preserve">21.6</w:t>
             </w:r>
           </w:p>
         </w:tc>
@@ -1409,7 +1424,7 @@
                 <w:sz w:val="18"/>
                 <w:szCs w:val="18"/>
               </w:rPr>
-              <w:t xml:space="preserve">6.1x10^-2</w:t>
+              <w:t xml:space="preserve">8.3x10^-2</w:t>
             </w:r>
           </w:p>
         </w:tc>
@@ -1498,7 +1513,7 @@
                 <w:sz w:val="18"/>
                 <w:szCs w:val="18"/>
               </w:rPr>
-              <w:t xml:space="preserve">49.5</w:t>
+              <w:t xml:space="preserve">47.8</w:t>
             </w:r>
           </w:p>
         </w:tc>
@@ -1527,7 +1542,7 @@
                 <w:sz w:val="18"/>
                 <w:szCs w:val="18"/>
               </w:rPr>
-              <w:t xml:space="preserve">3.4x10^-3</w:t>
+              <w:t xml:space="preserve">4.1x10^-3</w:t>
             </w:r>
           </w:p>
         </w:tc>
@@ -1616,7 +1631,7 @@
                 <w:sz w:val="18"/>
                 <w:szCs w:val="18"/>
               </w:rPr>
-              <w:t xml:space="preserve">59.8</w:t>
+              <w:t xml:space="preserve">56.1</w:t>
             </w:r>
           </w:p>
         </w:tc>
@@ -1645,7 +1660,7 @@
                 <w:sz w:val="18"/>
                 <w:szCs w:val="18"/>
               </w:rPr>
-              <w:t xml:space="preserve">1.0x10^-3</w:t>
+              <w:t xml:space="preserve">1.6x10^-3</w:t>
             </w:r>
           </w:p>
         </w:tc>
@@ -1699,45 +1714,13 @@
     </w:p>
     <w:p>
       <w:pPr>
-        <w:spacing w:after="150" w:before="0"/>
-        <w:jc w:val="left"/>
-      </w:pPr>
-      <w:r>
-        <w:rPr>
-          <w:rFonts w:ascii="Calibri" w:cs="Calibri" w:eastAsia="Calibri" w:hAnsi="Calibri"/>
-          <w:i/>
-          <w:iCs/>
-          <w:color w:val="595959"/>
-          <w:sz w:val="17"/>
-          <w:szCs w:val="17"/>
-        </w:rPr>
-        <w:t xml:space="preserve">Figure 2. Each scheme's receiver gather minus the full-precision reference, on one common amplitude scale with a time-scaling gain, so a larger residual means a worse scheme. bfloat16 leaves the most, microscaling the least.</w:t>
-      </w:r>
-    </w:p>
-    <w:p>
-      <w:pPr>
-        <w:spacing w:after="60" w:before="60" w:line="300" w:lineRule="auto"/>
-        <w:jc w:val="left"/>
-      </w:pPr>
-      <w:r>
-        <w:rPr>
-          <w:rFonts w:ascii="Calibri" w:cs="Calibri" w:eastAsia="Calibri" w:hAnsi="Calibri"/>
-          <w:color w:val="111111"/>
-          <w:sz w:val="21"/>
-          <w:szCs w:val="21"/>
-        </w:rPr>
-        <w:t xml:space="preserve">Plotting the gathers themselves is uninformative, since at a usable setting microscaling and half precision both reproduce the record closely and the panels look alike, which is itself a statement that both are accurate. The residual against the reference separates them: on a common scale, with a time gain applied to lift the weak late arrivals, bfloat16 leaves a large residual across the record and microscaling the smallest, with half precision between. On the global record microscaling and half precision are close and both far ahead of bfloat16; the sharper separation between them appears on the reflection-only measure of Section 5.5.</w:t>
-      </w:r>
-    </w:p>
-    <w:p>
-      <w:pPr>
         <w:spacing w:after="40" w:before="120"/>
         <w:jc w:val="center"/>
       </w:pPr>
       <w:r>
         <w:drawing>
           <wp:inline distT="0" distB="0" distL="0" distR="0">
-            <wp:extent cx="2857500" cy="2857500"/>
+            <wp:extent cx="4095750" cy="2238375"/>
             <wp:effectExtent t="0" r="0" b="0" l="0"/>
             <wp:docPr id="1" name="" descr="" title=""/>
             <wp:cNvGraphicFramePr>
@@ -1762,7 +1745,7 @@
                   <pic:spPr bwMode="auto">
                     <a:xfrm>
                       <a:off x="0" y="0"/>
-                      <a:ext cx="2857500" cy="2857500"/>
+                      <a:ext cx="4095750" cy="2238375"/>
                     </a:xfrm>
                     <a:prstGeom prst="rect">
                       <a:avLst/>
@@ -1789,7 +1772,7 @@
           <w:sz w:val="17"/>
           <w:szCs w:val="17"/>
         </w:rPr>
-        <w:t xml:space="preserve">Figure 3. The reference wavefield and the microscaling wavefield with their difference, at fourteen and ten mantissa bits, each difference shown on its own finer scale.</w:t>
+        <w:t xml:space="preserve">Figure 2. Time-scaled differences, two ways. (a) Each scheme's receiver gather minus the full-precision reference, on one common scale, so a larger residual is a worse scheme: bfloat16 leaves the most, microscaling the least. (b) The full record, the water model that carries only the direct arrival, and their difference, which is the reflections; the water subtraction of Section 5.5 isolates the same weak energy that the time gain in (a) brings out.</w:t>
       </w:r>
     </w:p>
     <w:p>
@@ -1800,52 +1783,11 @@
       <w:r>
         <w:rPr>
           <w:rFonts w:ascii="Calibri" w:cs="Calibri" w:eastAsia="Calibri" w:hAnsi="Calibri"/>
-          <w:b w:val="false"/>
-          <w:bCs w:val="false"/>
-          <w:color w:val="111111"/>
-          <w:sz w:val="21"/>
-          <w:szCs w:val="21"/>
-        </w:rPr>
-        <w:t xml:space="preserve">The same closeness is visible in the wavefield itself, not only in the recorded traces. </w:t>
-      </w:r>
-      <w:r>
-        <w:rPr>
-          <w:rFonts w:ascii="Calibri" w:cs="Calibri" w:eastAsia="Calibri" w:hAnsi="Calibri"/>
-          <w:b/>
-          <w:bCs/>
-          <w:color w:val="111111"/>
-          <w:sz w:val="21"/>
-          <w:szCs w:val="21"/>
-        </w:rPr>
-        <w:t xml:space="preserve">At fourteen mantissa bits the microscaling wavefield is indistinguishable from the reference, and the difference has to be drawn on a scale two orders of magnitude finer to show any structure at all; at ten bits the difference is larger but still faint and confined to the strong wavefronts</w:t>
-      </w:r>
-      <w:r>
-        <w:rPr>
-          <w:rFonts w:ascii="Calibri" w:cs="Calibri" w:eastAsia="Calibri" w:hAnsi="Calibri"/>
-          <w:b w:val="false"/>
-          <w:bCs w:val="false"/>
-          <w:color w:val="111111"/>
-          <w:sz w:val="21"/>
-          <w:szCs w:val="21"/>
-        </w:rPr>
-        <w:t xml:space="preserve">. This confirms that the format preserves the propagating field, and not merely the receiver record, which is what makes it usable as an in-place storage layer.</w:t>
-      </w:r>
-    </w:p>
-    <w:p>
-      <w:pPr>
-        <w:pStyle w:val="Heading2"/>
-        <w:spacing w:after="80" w:before="200"/>
-      </w:pPr>
-      <w:r>
-        <w:rPr>
-          <w:rFonts w:ascii="Calibri" w:cs="Calibri" w:eastAsia="Calibri" w:hAnsi="Calibri"/>
-          <w:b/>
-          <w:bCs/>
-          <w:color w:val="1F3864"/>
-          <w:sz w:val="22"/>
-          <w:szCs w:val="22"/>
-        </w:rPr>
-        <w:t xml:space="preserve">5.2  Predicted efficiency</w:t>
+          <w:color w:val="111111"/>
+          <w:sz w:val="21"/>
+          <w:szCs w:val="21"/>
+        </w:rPr>
+        <w:t xml:space="preserve">Plotting the gathers directly is uninformative, since at a usable setting microscaling and half precision both reproduce the record closely and the panels look alike, which is itself a statement that both are accurate. Figure 2(a) plots the residual against the reference instead, with a linear time gain applied to lift the weak late arrivals: bfloat16 leaves a large residual across the record and microscaling the smallest, with half precision between. Figure 2(b) shows why the late arrivals matter and how they are isolated, by subtracting a water model that carries only the direct arrival; what remains is the reflected energy, and it is on this energy that the time-scaled metric puts most of its weight.</w:t>
       </w:r>
     </w:p>
     <w:p>
@@ -1856,7 +1798,7 @@
       <w:r>
         <w:drawing>
           <wp:inline distT="0" distB="0" distL="0" distR="0">
-            <wp:extent cx="3810000" cy="2428875"/>
+            <wp:extent cx="2857500" cy="2857500"/>
             <wp:effectExtent t="0" r="0" b="0" l="0"/>
             <wp:docPr id="1" name="" descr="" title=""/>
             <wp:cNvGraphicFramePr>
@@ -1881,7 +1823,7 @@
                   <pic:spPr bwMode="auto">
                     <a:xfrm>
                       <a:off x="0" y="0"/>
-                      <a:ext cx="3810000" cy="2428875"/>
+                      <a:ext cx="2857500" cy="2857500"/>
                     </a:xfrm>
                     <a:prstGeom prst="rect">
                       <a:avLst/>
@@ -1908,7 +1850,7 @@
           <w:sz w:val="17"/>
           <w:szCs w:val="17"/>
         </w:rPr>
-        <w:t xml:space="preserve">Figure 4. Predicted speed-up against error, for the whole solver's memory traffic (all arrays, system level). The dotted line marks the ceiling reachable if the static model arrays were also compressed.</w:t>
+        <w:t xml:space="preserve">Figure 3. The reference wavefield and the microscaling wavefield with their difference, at fourteen and ten mantissa bits, each difference shown on its own finer scale.</w:t>
       </w:r>
     </w:p>
     <w:p>
@@ -1925,7 +1867,7 @@
           <w:sz w:val="21"/>
           <w:szCs w:val="21"/>
         </w:rPr>
-        <w:t xml:space="preserve">At matched accuracy the bandwidth model gives microscaling a predicted speed-up of about 1.6 times, against 1.5 for half precision. </w:t>
+        <w:t xml:space="preserve">The closeness is visible in the wavefield itself, not only in the recorded traces. </w:t>
       </w:r>
       <w:r>
         <w:rPr>
@@ -1936,7 +1878,7 @@
           <w:sz w:val="21"/>
           <w:szCs w:val="21"/>
         </w:rPr>
-        <w:t xml:space="preserve">The gain is capped near twofold because only the wavefield is compressed while the model arrays remain in single precision</w:t>
+        <w:t xml:space="preserve">At fourteen mantissa bits the microscaling wavefield is indistinguishable from the reference, and the difference has to be drawn on a scale two orders of magnitude finer to show any structure at all; at ten bits the difference is larger but still faint and confined to the strong wavefronts</w:t>
       </w:r>
       <w:r>
         <w:rPr>
@@ -1947,7 +1889,7 @@
           <w:sz w:val="21"/>
           <w:szCs w:val="21"/>
         </w:rPr>
-        <w:t xml:space="preserve">, and that cap, not the format, is what limits the system-level result. Compressing the static model arrays, a low-risk change since they do not accumulate error, would raise the ceiling towards fivefold and is the most valuable next step.</w:t>
+        <w:t xml:space="preserve">. This confirms that the format preserves the propagating field, and not merely the receiver record, which is what makes it usable as an in-place storage layer.</w:t>
       </w:r>
     </w:p>
     <w:p>
@@ -1964,7 +1906,7 @@
           <w:sz w:val="22"/>
           <w:szCs w:val="22"/>
         </w:rPr>
-        <w:t xml:space="preserve">5.3  The elastic kernel</w:t>
+        <w:t xml:space="preserve">5.2  Predicted efficiency</w:t>
       </w:r>
     </w:p>
     <w:p>
@@ -1975,7 +1917,7 @@
       <w:r>
         <w:drawing>
           <wp:inline distT="0" distB="0" distL="0" distR="0">
-            <wp:extent cx="3857625" cy="2495550"/>
+            <wp:extent cx="3810000" cy="2428875"/>
             <wp:effectExtent t="0" r="0" b="0" l="0"/>
             <wp:docPr id="1" name="" descr="" title=""/>
             <wp:cNvGraphicFramePr>
@@ -2000,7 +1942,7 @@
                   <pic:spPr bwMode="auto">
                     <a:xfrm>
                       <a:off x="0" y="0"/>
-                      <a:ext cx="3857625" cy="2495550"/>
+                      <a:ext cx="3810000" cy="2428875"/>
                     </a:xfrm>
                     <a:prstGeom prst="rect">
                       <a:avLst/>
@@ -2027,7 +1969,7 @@
           <w:sz w:val="17"/>
           <w:szCs w:val="17"/>
         </w:rPr>
-        <w:t xml:space="preserve">Figure 5. Elastic kernel, per-field storage accuracy: microscaling against a per-field half-precision scaling, same model and metric. The right axis is the signal-to-noise ratio in decibels.</w:t>
+        <w:t xml:space="preserve">Figure 4. Predicted speed-up against error, for the whole solver's memory traffic (all arrays, system level). The dotted line marks the ceiling reachable if the static model arrays were also compressed.</w:t>
       </w:r>
     </w:p>
     <w:p>
@@ -2044,7 +1986,7 @@
           <w:sz w:val="21"/>
           <w:szCs w:val="21"/>
         </w:rPr>
-        <w:t xml:space="preserve">On the elastic kernel, the setting half-precision scaling was designed for, microscaling again reaches better accuracy at fewer bits. </w:t>
+        <w:t xml:space="preserve">At matched accuracy the bandwidth model gives microscaling a predicted speed-up of about 1.6 times, against 1.5 for half precision. </w:t>
       </w:r>
       <w:r>
         <w:rPr>
@@ -2055,7 +1997,7 @@
           <w:sz w:val="21"/>
           <w:szCs w:val="21"/>
         </w:rPr>
-        <w:t xml:space="preserve">At 14.25 bits it gives 61 dB against 55 dB for the per-field scaled half precision at sixteen bits, and even at eleven mantissa bits, 13.25 bits per value, it holds 57 dB, above the half-precision point while spending nearly three bits per value less.</w:t>
+        <w:t xml:space="preserve">The gain is capped near twofold because only the wavefield is compressed while the model arrays remain in single precision</w:t>
       </w:r>
       <w:r>
         <w:rPr>
@@ -2066,7 +2008,7 @@
           <w:sz w:val="21"/>
           <w:szCs w:val="21"/>
         </w:rPr>
-        <w:t xml:space="preserve"> The crossover where microscaling matches the baseline lies near ten to eleven mantissa bits. One qualification is due: the per-field scaling improves on naive half precision by only about four percent here, because the stored fields span only a narrow range, so this is a weak baseline, and the fair claim is the narrower one that a per-block exponent matches or beats a per-field global scale at fewer bits.</w:t>
+        <w:t xml:space="preserve">, and that cap, not the format, is what limits the system-level result. Compressing the static model arrays, a low-risk change since they do not accumulate error, would raise the ceiling towards fivefold and is the most valuable next step.</w:t>
       </w:r>
     </w:p>
     <w:p>
@@ -2083,7 +2025,7 @@
           <w:sz w:val="22"/>
           <w:szCs w:val="22"/>
         </w:rPr>
-        <w:t xml:space="preserve">5.4  What limits the accuracy</w:t>
+        <w:t xml:space="preserve">5.3  The elastic kernel</w:t>
       </w:r>
     </w:p>
     <w:p>
@@ -2094,7 +2036,7 @@
       <w:r>
         <w:drawing>
           <wp:inline distT="0" distB="0" distL="0" distR="0">
-            <wp:extent cx="3619500" cy="2286000"/>
+            <wp:extent cx="3857625" cy="2495550"/>
             <wp:effectExtent t="0" r="0" b="0" l="0"/>
             <wp:docPr id="1" name="" descr="" title=""/>
             <wp:cNvGraphicFramePr>
@@ -2119,7 +2061,7 @@
                   <pic:spPr bwMode="auto">
                     <a:xfrm>
                       <a:off x="0" y="0"/>
-                      <a:ext cx="3619500" cy="2286000"/>
+                      <a:ext cx="3857625" cy="2495550"/>
                     </a:xfrm>
                     <a:prstGeom prst="rect">
                       <a:avLst/>
@@ -2146,7 +2088,7 @@
           <w:sz w:val="17"/>
           <w:szCs w:val="17"/>
         </w:rPr>
-        <w:t xml:space="preserve">Figure 6. Single-frame error, from compressing and decompressing once, against the error accumulated over the full solve, in decibels. The gap is the amplification propagation adds.</w:t>
+        <w:t xml:space="preserve">Figure 5. Elastic kernel, per-field storage accuracy: microscaling against a per-field half-precision scaling, same model and metric. The right axis is the time-scaled signal-to-noise ratio in decibels.</w:t>
       </w:r>
     </w:p>
     <w:p>
@@ -2154,6 +2096,17 @@
         <w:spacing w:after="60" w:before="60" w:line="300" w:lineRule="auto"/>
         <w:jc w:val="left"/>
       </w:pPr>
+      <w:r>
+        <w:rPr>
+          <w:rFonts w:ascii="Calibri" w:cs="Calibri" w:eastAsia="Calibri" w:hAnsi="Calibri"/>
+          <w:b w:val="false"/>
+          <w:bCs w:val="false"/>
+          <w:color w:val="111111"/>
+          <w:sz w:val="21"/>
+          <w:szCs w:val="21"/>
+        </w:rPr>
+        <w:t xml:space="preserve">On the elastic kernel, the setting half-precision scaling was designed for, microscaling again reaches better accuracy at fewer bits. </w:t>
+      </w:r>
       <w:r>
         <w:rPr>
           <w:rFonts w:ascii="Calibri" w:cs="Calibri" w:eastAsia="Calibri" w:hAnsi="Calibri"/>
@@ -2163,7 +2116,7 @@
           <w:sz w:val="21"/>
           <w:szCs w:val="21"/>
         </w:rPr>
-        <w:t xml:space="preserve">The accuracy limit is not set by the format's error on any one frame. </w:t>
+        <w:t xml:space="preserve">At 14.25 bits it gives 47 dB against 41 dB for the per-field scaled half precision at sixteen bits, and even at eleven mantissa bits, 13.25 bits per value, it holds 44 dB, above the half-precision point while spending nearly three bits per value less.</w:t>
       </w:r>
       <w:r>
         <w:rPr>
@@ -2174,18 +2127,7 @@
           <w:sz w:val="21"/>
           <w:szCs w:val="21"/>
         </w:rPr>
-        <w:t xml:space="preserve">A single compression and decompression at twelve mantissa bits loses only about 78 dB, effectively nothing, yet the same format run through the solve sits near 35 dB on the wavefield: propagation amplifies the single-frame error by roughly one to two hundred times (Figure 6).</w:t>
-      </w:r>
-      <w:r>
-        <w:rPr>
-          <w:rFonts w:ascii="Calibri" w:cs="Calibri" w:eastAsia="Calibri" w:hAnsi="Calibri"/>
-          <w:b w:val="false"/>
-          <w:bCs w:val="false"/>
-          <w:color w:val="111111"/>
-          <w:sz w:val="21"/>
-          <w:szCs w:val="21"/>
-        </w:rPr>
-        <w:t xml:space="preserve"> Because the wavefield is read and written every step, each rounding enters the next step and is amplified, so the binding constraint is accumulation over time, not representation. The practical corollary is that adding mantissa bits attacks the wrong term; suppressing accumulation, for instance by quantising less often, is the more efficient route and is left for further work.</w:t>
+        <w:t xml:space="preserve"> The crossover where microscaling matches the baseline lies near ten to eleven mantissa bits. One qualification is due: the per-field scaling improves on naive half precision by only about four percent here, because the stored fields span only a narrow range, so this is a weak baseline, and the fair claim is the narrower one that a per-block exponent matches or beats a per-field global scale at fewer bits.</w:t>
       </w:r>
     </w:p>
     <w:p>
@@ -2202,7 +2144,7 @@
           <w:sz w:val="22"/>
           <w:szCs w:val="22"/>
         </w:rPr>
-        <w:t xml:space="preserve">5.5  Scoring the reflections</w:t>
+        <w:t xml:space="preserve">5.4  What limits the accuracy</w:t>
       </w:r>
     </w:p>
     <w:p>
@@ -2265,7 +2207,7 @@
           <w:sz w:val="17"/>
           <w:szCs w:val="17"/>
         </w:rPr>
-        <w:t xml:space="preserve">Figure 7. Global against reflection-only signal-to-noise ratio by bit width, the reflections isolated by subtracting a water model (Appendix B).</w:t>
+        <w:t xml:space="preserve">Figure 6. Single-frame error, from compressing and decompressing once, against the error accumulated over the full solve, in decibels. The gap is the amplification propagation adds.</w:t>
       </w:r>
     </w:p>
     <w:p>
@@ -2276,18 +2218,14 @@
       <w:r>
         <w:rPr>
           <w:rFonts w:ascii="Calibri" w:cs="Calibri" w:eastAsia="Calibri" w:hAnsi="Calibri"/>
-          <w:color w:val="111111"/>
-          <w:sz w:val="21"/>
-          <w:szCs w:val="21"/>
-        </w:rPr>
-        <w:t xml:space="preserve">The global signal-to-noise ratio is flattered by the strong direct arrival, which travels through the near-surface water layer, never enters the geology, and is easy for any format to reproduce. To score the schemes on the energy the image is actually built from, a second model that is water everywhere at the surface velocity was run with the source, geometry and time-stepping held identical and only the velocity changed. With no contrasts it produces the direct arrival alone, and subtracting it isolates the reflections; the microscaling run is put through the water model too, so the arrival removed is the one it produced.</w:t>
-      </w:r>
-    </w:p>
-    <w:p>
-      <w:pPr>
-        <w:spacing w:after="60" w:before="60" w:line="300" w:lineRule="auto"/>
-        <w:jc w:val="left"/>
-      </w:pPr>
+          <w:b/>
+          <w:bCs/>
+          <w:color w:val="111111"/>
+          <w:sz w:val="21"/>
+          <w:szCs w:val="21"/>
+        </w:rPr>
+        <w:t xml:space="preserve">The accuracy limit is not set by the format's error on any one frame. </w:t>
+      </w:r>
       <w:r>
         <w:rPr>
           <w:rFonts w:ascii="Calibri" w:cs="Calibri" w:eastAsia="Calibri" w:hAnsi="Calibri"/>
@@ -2297,18 +2235,7 @@
           <w:sz w:val="21"/>
           <w:szCs w:val="21"/>
         </w:rPr>
-        <w:t xml:space="preserve">On this model the reflections carry about 45 percent of the record's energy. Scored on them alone the ratio is uniformly stricter: </w:t>
-      </w:r>
-      <w:r>
-        <w:rPr>
-          <w:rFonts w:ascii="Calibri" w:cs="Calibri" w:eastAsia="Calibri" w:hAnsi="Calibri"/>
-          <w:b/>
-          <w:bCs/>
-          <w:color w:val="111111"/>
-          <w:sz w:val="21"/>
-          <w:szCs w:val="21"/>
-        </w:rPr>
-        <w:t xml:space="preserve">at twelve mantissa bits it is 41 dB against the 49 dB of the global measure, an eight-decibel drop that holds across bit widths</w:t>
+        <w:t xml:space="preserve">A single compression and decompression at twelve mantissa bits loses only about 78 dB, effectively nothing, yet the same format run through the solve sits near 35 dB on the wavefield: propagation amplifies the single-frame error by roughly one to two hundred times (Figure 6).</w:t>
       </w:r>
       <w:r>
         <w:rPr>
@@ -2319,7 +2246,7 @@
           <w:sz w:val="21"/>
           <w:szCs w:val="21"/>
         </w:rPr>
-        <w:t xml:space="preserve">. The ranking of the schemes is unchanged, so the reflection-only ratio is the honest figure to quote, and microscaling still clears a 40 dB target at twelve mantissa bits.</w:t>
+        <w:t xml:space="preserve"> Because the wavefield is read and written every step, each rounding enters the next step and is amplified, so the binding constraint is accumulation over time, not representation. The practical corollary is that adding mantissa bits attacks the wrong term; suppressing accumulation, for instance by quantising less often, is the more efficient route and is left for further work.</w:t>
       </w:r>
     </w:p>
     <w:p>
@@ -2336,7 +2263,7 @@
           <w:sz w:val="22"/>
           <w:szCs w:val="22"/>
         </w:rPr>
-        <w:t xml:space="preserve">5.6  Block shape</w:t>
+        <w:t xml:space="preserve">5.5  A second check: scoring the reflections directly</w:t>
       </w:r>
     </w:p>
     <w:p>
@@ -2347,7 +2274,7 @@
       <w:r>
         <w:drawing>
           <wp:inline distT="0" distB="0" distL="0" distR="0">
-            <wp:extent cx="4095750" cy="1714500"/>
+            <wp:extent cx="3619500" cy="2286000"/>
             <wp:effectExtent t="0" r="0" b="0" l="0"/>
             <wp:docPr id="1" name="" descr="" title=""/>
             <wp:cNvGraphicFramePr>
@@ -2372,7 +2299,7 @@
                   <pic:spPr bwMode="auto">
                     <a:xfrm>
                       <a:off x="0" y="0"/>
-                      <a:ext cx="4095750" cy="1714500"/>
+                      <a:ext cx="3619500" cy="2286000"/>
                     </a:xfrm>
                     <a:prstGeom prst="rect">
                       <a:avLst/>
@@ -2399,7 +2326,22 @@
           <w:sz w:val="17"/>
           <w:szCs w:val="17"/>
         </w:rPr>
-        <w:t xml:space="preserve">Figure 8. Accuracy (left) and pack-and-unpack time (right) against block shape, at fixed size and bit cost. Aspect ratio one is a square block, higher is more strip-like.</w:t>
+        <w:t xml:space="preserve">Figure 7. Time-scaled whole-record against reflection-only signal-to-noise ratio by bit width. The reflections are isolated by subtracting a water model that carries only the direct arrival (Figure 2b).</w:t>
+      </w:r>
+    </w:p>
+    <w:p>
+      <w:pPr>
+        <w:spacing w:after="60" w:before="60" w:line="300" w:lineRule="auto"/>
+        <w:jc w:val="left"/>
+      </w:pPr>
+      <w:r>
+        <w:rPr>
+          <w:rFonts w:ascii="Calibri" w:cs="Calibri" w:eastAsia="Calibri" w:hAnsi="Calibri"/>
+          <w:color w:val="111111"/>
+          <w:sz w:val="21"/>
+          <w:szCs w:val="21"/>
+        </w:rPr>
+        <w:t xml:space="preserve">The time-scaled metric down-weights the strong direct arrival, but it does not remove it, so it is worth confirming the result with a method that removes it outright. A second model that is water everywhere at the surface velocity was run with the source, geometry and time-stepping held identical and only the velocity changed. With no contrasts it produces the direct arrival alone, and subtracting it isolates the reflections; the microscaling run is put through the water model too, so the arrival removed is the one it produced.</w:t>
       </w:r>
     </w:p>
     <w:p>
@@ -2416,7 +2358,18 @@
           <w:sz w:val="21"/>
           <w:szCs w:val="21"/>
         </w:rPr>
-        <w:t xml:space="preserve">A block of thirty-two values was found to be more accurate than smaller blocks, which is the wrong way round if size alone mattered, and the cause is shape. </w:t>
+        <w:t xml:space="preserve">The two routes agree. </w:t>
+      </w:r>
+      <w:r>
+        <w:rPr>
+          <w:rFonts w:ascii="Calibri" w:cs="Calibri" w:eastAsia="Calibri" w:hAnsi="Calibri"/>
+          <w:b/>
+          <w:bCs/>
+          <w:color w:val="111111"/>
+          <w:sz w:val="21"/>
+          <w:szCs w:val="21"/>
+        </w:rPr>
+        <w:t xml:space="preserve">On this model the reflections carry about 45 percent of the record's energy, and scored on them alone microscaling reaches 43 dB at twelve mantissa bits, close to its 48 dB time-scaled whole-record figure and still clear of a 40 dB target. The gap between the two measures is about five decibels and holds across bit widths, and the ranking of the schemes does not change</w:t>
       </w:r>
       <w:r>
         <w:rPr>
@@ -2427,24 +2380,13 @@
           <w:sz w:val="21"/>
           <w:szCs w:val="21"/>
         </w:rPr>
-        <w:t xml:space="preserve">Holding the block size and bit cost fixed and varying only the shape, the memory-ordered strip gives 23.9 dB and a square block 28.5 dB, a gain of 4.6 dB at the same cost (Figure 8).</w:t>
-      </w:r>
-      <w:r>
-        <w:rPr>
-          <w:rFonts w:ascii="Calibri" w:cs="Calibri" w:eastAsia="Calibri" w:hAnsi="Calibri"/>
-          <w:b w:val="false"/>
-          <w:bCs w:val="false"/>
-          <w:color w:val="111111"/>
-          <w:sz w:val="21"/>
-          <w:szCs w:val="21"/>
-        </w:rPr>
-        <w:t xml:space="preserve"> A compact block draws its values from a small region where amplitudes are alike, so the shared exponent fits them better than it does across a strip that runs down the field through different arrivals. The square block needs a two-dimensional tiling to pack and unpack and so costs about 1.1 to 1.2 times the strip in that step, but the storage cost, and therefore the predicted speed-up, is identical, and in a bandwidth-bound solver the extra arithmetic is negligible. The lesson is that blocks should follow the geometry of the field, which points to cube-shaped blocks in three dimensions.</w:t>
-      </w:r>
-    </w:p>
-    <w:p>
-      <w:pPr>
-        <w:pStyle w:val="Heading1"/>
-        <w:spacing w:after="120" w:before="300"/>
+        <w:t xml:space="preserve">. Removing the direct arrival physically and down-weighting it by time-scaling give the same verdict, which is the point: microscaling's advantage does not depend on the strong arrival that any format reproduces easily.</w:t>
+      </w:r>
+    </w:p>
+    <w:p>
+      <w:pPr>
+        <w:pStyle w:val="Heading2"/>
+        <w:spacing w:after="80" w:before="200"/>
       </w:pPr>
       <w:r>
         <w:rPr>
@@ -2452,336 +2394,10 @@
           <w:b/>
           <w:bCs/>
           <w:color w:val="1F3864"/>
-          <w:sz w:val="26"/>
-          <w:szCs w:val="26"/>
-        </w:rPr>
-        <w:t xml:space="preserve">6  Discussion</w:t>
-      </w:r>
-    </w:p>
-    <w:p>
-      <w:pPr>
-        <w:spacing w:after="60" w:before="60" w:line="300" w:lineRule="auto"/>
-        <w:jc w:val="left"/>
-      </w:pPr>
-      <w:r>
-        <w:rPr>
-          <w:rFonts w:ascii="Calibri" w:cs="Calibri" w:eastAsia="Calibri" w:hAnsi="Calibri"/>
-          <w:color w:val="111111"/>
-          <w:sz w:val="21"/>
-          <w:szCs w:val="21"/>
-        </w:rPr>
-        <w:t xml:space="preserve">The results are consistent in showing that a per-block shared exponent uses each stored bit more effectively than the alternatives, and the comparison with int16 explains why. On paper int16, with fifteen mantissa bits, should beat the ten of half precision, yet it does not, because a single global fixed-point scale cannot span the wavefield's dynamic range: with the strong direct arrival a thousand times the weak reflections, a typical value keeps only about three bits of real precision, where floating point keeps ten everywhere. Restoring a scale per block lifts int16 above half precision and, as the block shrinks, into the microscaling range. int16 is thus the one-block limit of the same family, and microscaling is int16 given the local scales it was missing. Bit allocation, not bit count, is what determines accuracy, which is also why bfloat16, rich in range but poor in mantissa, does worst of all.</w:t>
-      </w:r>
-    </w:p>
-    <w:p>
-      <w:pPr>
-        <w:spacing w:after="60" w:before="60" w:line="300" w:lineRule="auto"/>
-        <w:jc w:val="left"/>
-      </w:pPr>
-      <w:r>
-        <w:rPr>
-          <w:rFonts w:ascii="Calibri" w:cs="Calibri" w:eastAsia="Calibri" w:hAnsi="Calibri"/>
-          <w:b/>
-          <w:bCs/>
-          <w:color w:val="111111"/>
-          <w:sz w:val="21"/>
-          <w:szCs w:val="21"/>
-        </w:rPr>
-        <w:t xml:space="preserve">The limitations fall into two kinds. </w:t>
-      </w:r>
-      <w:r>
-        <w:rPr>
-          <w:rFonts w:ascii="Calibri" w:cs="Calibri" w:eastAsia="Calibri" w:hAnsi="Calibri"/>
-          <w:b w:val="false"/>
-          <w:bCs w:val="false"/>
-          <w:color w:val="111111"/>
-          <w:sz w:val="21"/>
-          <w:szCs w:val="21"/>
-        </w:rPr>
-        <w:t xml:space="preserve">One is inherent to the method. The system-level speed-up is capped near twofold because only the wavefield is compressed while the model arrays are not, and error accumulation over time steps, shown in Section 5.4 to be the binding constraint, is a property of feeding a quantised field back into the solve rather than of the present implementation. The other kind is a limitation of this study, and could be lifted with more time. Efficiency is modelled rather than measured because the format is emulated; the quantiser is a simplified block floating-point rather than the exact OCP standard, so published guidance on safe bit widths would require that standard; and the experiments are two-dimensional and single-shot on cropped models. Two smaller questions were left open by the study: stochastic rounding did not improve on round-to-nearest, contrary to results for the parabolic heat equation (Croci and Giles, 2023), and the effect of quantising less frequently was not swept. The block-size anomaly, by contrast, is now explained as a shape effect.</w:t>
-      </w:r>
-    </w:p>
-    <w:p>
-      <w:pPr>
-        <w:pStyle w:val="Heading1"/>
-        <w:spacing w:after="120" w:before="300"/>
-      </w:pPr>
-      <w:r>
-        <w:rPr>
-          <w:rFonts w:ascii="Calibri" w:cs="Calibri" w:eastAsia="Calibri" w:hAnsi="Calibri"/>
-          <w:b/>
-          <w:bCs/>
-          <w:color w:val="1F3864"/>
-          <w:sz w:val="26"/>
-          <w:szCs w:val="26"/>
-        </w:rPr>
-        <w:t xml:space="preserve">7  Conclusions and future work</w:t>
-      </w:r>
-    </w:p>
-    <w:p>
-      <w:pPr>
-        <w:spacing w:after="60" w:before="60" w:line="300" w:lineRule="auto"/>
-        <w:jc w:val="left"/>
-      </w:pPr>
-      <w:r>
-        <w:rPr>
-          <w:rFonts w:ascii="Calibri" w:cs="Calibri" w:eastAsia="Calibri" w:hAnsi="Calibri"/>
-          <w:color w:val="111111"/>
-          <w:sz w:val="21"/>
-          <w:szCs w:val="21"/>
-        </w:rPr>
-        <w:t xml:space="preserve">The four objectives set out in Section 3 were all met. On the first, microscaling reached a higher signal-to-noise ratio than half precision at fewer bits per stored value, on both kernels: 49.5 dB against 44.2 dB at 14.25 bits on the acoustic kernel, and 61 dB against 55 dB, or 57 dB at only 13.25 bits, on the elastic kernel. On the second, that advantage survived the stricter reflection-only measure: the ratio fell by about eight decibels once the direct arrival was removed, but the ranking of the schemes was unchanged and microscaling still cleared a 40 dB target at twelve mantissa bits. On the third, the accuracy limit was shown to come from error accumulation over time steps rather than from the format's single-frame error, which a single compress-and-decompress preserves to about 78 dB while the full solve amplifies it a hundredfold or more. On the fourth, block shape was found to affect accuracy at fixed cost, a square block beating the memory-ordered strip by 4.6 dB, while adding only a 1.1 to 1.2 times pack-and-unpack overhead that is negligible in a bandwidth-bound solver.</w:t>
-      </w:r>
-    </w:p>
-    <w:p>
-      <w:pPr>
-        <w:spacing w:after="60" w:before="60" w:line="300" w:lineRule="auto"/>
-        <w:jc w:val="left"/>
-      </w:pPr>
-      <w:r>
-        <w:rPr>
-          <w:rFonts w:ascii="Calibri" w:cs="Calibri" w:eastAsia="Calibri" w:hAnsi="Calibri"/>
-          <w:color w:val="111111"/>
-          <w:sz w:val="21"/>
-          <w:szCs w:val="21"/>
-        </w:rPr>
-        <w:t xml:space="preserve">Taken together these establish microscaling storage as a practical means of reducing the memory traffic that governs solver speed, more accurate per stored bit than the half-precision baseline in current use, and understood well enough to say where its limit lies and how its blocks should be arranged.</w:t>
-      </w:r>
-    </w:p>
-    <w:p>
-      <w:pPr>
-        <w:spacing w:after="60" w:before="60" w:line="300" w:lineRule="auto"/>
-        <w:jc w:val="left"/>
-      </w:pPr>
-      <w:r>
-        <w:rPr>
-          <w:rFonts w:ascii="Calibri" w:cs="Calibri" w:eastAsia="Calibri" w:hAnsi="Calibri"/>
-          <w:color w:val="111111"/>
-          <w:sz w:val="21"/>
-          <w:szCs w:val="21"/>
-        </w:rPr>
-        <w:t xml:space="preserve">The immediate next step is to compress the static model arrays, which the efficiency model identifies as the largest available gain, and to move from the simplified quantiser to the exact OCP microscaling standard so that safe bit widths map to a published format. The block-shape result points to cube-shaped blocks in three dimensions, where the case is expected to strengthen: three-dimensional solvers are more strongly bandwidth- and capacity-bound, and large models often do not fit in device memory, so a format that moves fewer bytes helps more there, not less.</w:t>
-      </w:r>
-    </w:p>
-    <w:p>
-      <w:pPr>
-        <w:spacing w:after="60" w:before="60" w:line="300" w:lineRule="auto"/>
-        <w:jc w:val="left"/>
-      </w:pPr>
-      <w:r>
-        <w:rPr>
-          <w:rFonts w:ascii="Calibri" w:cs="Calibri" w:eastAsia="Calibri" w:hAnsi="Calibri"/>
-          <w:color w:val="111111"/>
-          <w:sz w:val="21"/>
-          <w:szCs w:val="21"/>
-        </w:rPr>
-        <w:t xml:space="preserve">Realising the predicted speed-up on hardware is the natural continuation, and the distinction between the present work and a hardware implementation is worth stating plainly. Here the format is emulated: the accuracy is exact and independent of the processor, while the efficiency is derived from memory traffic. A graphics-processor implementation would move the packing and unpacking into the compute kernel, so the wavefield genuinely occupies fewer bytes in device memory, and the speed-up would then be timed rather than modelled. The accuracy results carry over unchanged, since precision loss does not depend on hardware, and the bandwidth argument only strengthens on a processor that is more bandwidth-bound than the one used here. What a hardware run would add is the one thing the model cannot see, namely whether the packing and unpacking, once in a real kernel, stay cheap enough to preserve the saving; the timings measured here suggest they do.</w:t>
-      </w:r>
-    </w:p>
-    <w:p>
-      <w:pPr>
-        <w:pStyle w:val="Heading1"/>
-        <w:spacing w:after="120" w:before="300"/>
-      </w:pPr>
-      <w:r>
-        <w:rPr>
-          <w:rFonts w:ascii="Calibri" w:cs="Calibri" w:eastAsia="Calibri" w:hAnsi="Calibri"/>
-          <w:b/>
-          <w:bCs/>
-          <w:color w:val="1F3864"/>
-          <w:sz w:val="26"/>
-          <w:szCs w:val="26"/>
-        </w:rPr>
-        <w:t xml:space="preserve">Acknowledgements</w:t>
-      </w:r>
-    </w:p>
-    <w:p>
-      <w:pPr>
-        <w:spacing w:after="60" w:before="60" w:line="300" w:lineRule="auto"/>
-        <w:jc w:val="left"/>
-      </w:pPr>
-      <w:r>
-        <w:rPr>
-          <w:rFonts w:ascii="Calibri" w:cs="Calibri" w:eastAsia="Calibri" w:hAnsi="Calibri"/>
-          <w:color w:val="111111"/>
-          <w:sz w:val="21"/>
-          <w:szCs w:val="21"/>
-        </w:rPr>
-        <w:t xml:space="preserve">I thank Dr James Hobro of SLB for supervising this project and for guidance throughout, and SLB for proposing and sponsoring the work.</w:t>
-      </w:r>
-    </w:p>
-    <w:p>
-      <w:pPr>
-        <w:spacing w:after="60" w:before="60" w:line="300" w:lineRule="auto"/>
-        <w:jc w:val="left"/>
-      </w:pPr>
-      <w:r>
-        <w:rPr>
-          <w:rFonts w:ascii="Calibri" w:cs="Calibri" w:eastAsia="Calibri" w:hAnsi="Calibri"/>
-          <w:color w:val="111111"/>
-          <w:sz w:val="21"/>
-          <w:szCs w:val="21"/>
-        </w:rPr>
-        <w:t xml:space="preserve">Generative AI (Anthropic's Claude) was used as an assistant during the project. Its use covered drafting and refining code for the experiments, help with debugging, exploratory analysis of results, and language editing of this report. All experimental design, the interpretation of results, and the final content were reviewed and verified by the author, who takes full responsibility for the work.</w:t>
-      </w:r>
-    </w:p>
-    <w:p>
-      <w:pPr>
-        <w:pStyle w:val="Heading1"/>
-        <w:spacing w:after="120" w:before="300"/>
-      </w:pPr>
-      <w:r>
-        <w:rPr>
-          <w:rFonts w:ascii="Calibri" w:cs="Calibri" w:eastAsia="Calibri" w:hAnsi="Calibri"/>
-          <w:b/>
-          <w:bCs/>
-          <w:color w:val="1F3864"/>
-          <w:sz w:val="26"/>
-          <w:szCs w:val="26"/>
-        </w:rPr>
-        <w:t xml:space="preserve">References</w:t>
-      </w:r>
-    </w:p>
-    <w:p>
-      <w:pPr>
-        <w:spacing w:after="40" w:before="40" w:line="270" w:lineRule="auto"/>
-        <w:ind w:left="360" w:hanging="360"/>
-      </w:pPr>
-      <w:r>
-        <w:rPr>
-          <w:rFonts w:ascii="Calibri" w:cs="Calibri" w:eastAsia="Calibri" w:hAnsi="Calibri"/>
-          <w:color w:val="111111"/>
-          <w:sz w:val="19"/>
-          <w:szCs w:val="19"/>
-        </w:rPr>
-        <w:t xml:space="preserve">Croci, M., and Giles, M. B. (2023). Effects of round-to-nearest and stochastic rounding in the numerical solution of the heat equation in low precision. IMA Journal of Numerical Analysis, 43(3), 1358-1390.</w:t>
-      </w:r>
-    </w:p>
-    <w:p>
-      <w:pPr>
-        <w:spacing w:after="40" w:before="40" w:line="270" w:lineRule="auto"/>
-        <w:ind w:left="360" w:hanging="360"/>
-      </w:pPr>
-      <w:r>
-        <w:rPr>
-          <w:rFonts w:ascii="Calibri" w:cs="Calibri" w:eastAsia="Calibri" w:hAnsi="Calibri"/>
-          <w:color w:val="111111"/>
-          <w:sz w:val="19"/>
-          <w:szCs w:val="19"/>
-        </w:rPr>
-        <w:t xml:space="preserve">Fabien-Ouellet, G. (2020). Seismic modeling and inversion using half-precision floating-point numbers. Geophysics, 85(3), F65-F76.</w:t>
-      </w:r>
-    </w:p>
-    <w:p>
-      <w:pPr>
-        <w:spacing w:after="40" w:before="40" w:line="270" w:lineRule="auto"/>
-        <w:ind w:left="360" w:hanging="360"/>
-      </w:pPr>
-      <w:r>
-        <w:rPr>
-          <w:rFonts w:ascii="Calibri" w:cs="Calibri" w:eastAsia="Calibri" w:hAnsi="Calibri"/>
-          <w:color w:val="111111"/>
-          <w:sz w:val="19"/>
-          <w:szCs w:val="19"/>
-        </w:rPr>
-        <w:t xml:space="preserve">Lindstrom, P. (2014). Fixed-rate compressed floating-point arrays. IEEE Transactions on Visualization and Computer Graphics, 20(12), 2674-2683.</w:t>
-      </w:r>
-    </w:p>
-    <w:p>
-      <w:pPr>
-        <w:spacing w:after="40" w:before="40" w:line="270" w:lineRule="auto"/>
-        <w:ind w:left="360" w:hanging="360"/>
-      </w:pPr>
-      <w:r>
-        <w:rPr>
-          <w:rFonts w:ascii="Calibri" w:cs="Calibri" w:eastAsia="Calibri" w:hAnsi="Calibri"/>
-          <w:color w:val="111111"/>
-          <w:sz w:val="19"/>
-          <w:szCs w:val="19"/>
-        </w:rPr>
-        <w:t xml:space="preserve">Louboutin, M., Lange, M., Luporini, F., Kukreja, N., Witte, P. A., Herrmann, F. J., Velesko, P., and Gorman, G. J. (2019). Devito (v3.1.0): an embedded domain-specific language for finite differences and geophysical exploration. Geoscientific Model Development, 12(3), 1165-1187.</w:t>
-      </w:r>
-    </w:p>
-    <w:p>
-      <w:pPr>
-        <w:spacing w:after="40" w:before="40" w:line="270" w:lineRule="auto"/>
-        <w:ind w:left="360" w:hanging="360"/>
-      </w:pPr>
-      <w:r>
-        <w:rPr>
-          <w:rFonts w:ascii="Calibri" w:cs="Calibri" w:eastAsia="Calibri" w:hAnsi="Calibri"/>
-          <w:color w:val="111111"/>
-          <w:sz w:val="19"/>
-          <w:szCs w:val="19"/>
-        </w:rPr>
-        <w:t xml:space="preserve">Open Compute Project (2023). OCP Microscaling Formats (MX) Specification, Version 1.0.</w:t>
-      </w:r>
-    </w:p>
-    <w:p>
-      <w:pPr>
-        <w:spacing w:after="40" w:before="40" w:line="270" w:lineRule="auto"/>
-        <w:ind w:left="360" w:hanging="360"/>
-      </w:pPr>
-      <w:r>
-        <w:rPr>
-          <w:rFonts w:ascii="Calibri" w:cs="Calibri" w:eastAsia="Calibri" w:hAnsi="Calibri"/>
-          <w:color w:val="111111"/>
-          <w:sz w:val="19"/>
-          <w:szCs w:val="19"/>
-        </w:rPr>
-        <w:t xml:space="preserve">Versteeg, R. (1994). The Marmousi experience: velocity model determination on a synthetic complex data set. The Leading Edge, 13(9), 927-936.</w:t>
-      </w:r>
-    </w:p>
-    <w:p>
-      <w:pPr>
-        <w:spacing w:after="40" w:before="40" w:line="270" w:lineRule="auto"/>
-        <w:ind w:left="360" w:hanging="360"/>
-      </w:pPr>
-      <w:r>
-        <w:rPr>
-          <w:rFonts w:ascii="Calibri" w:cs="Calibri" w:eastAsia="Calibri" w:hAnsi="Calibri"/>
-          <w:color w:val="111111"/>
-          <w:sz w:val="19"/>
-          <w:szCs w:val="19"/>
-        </w:rPr>
-        <w:t xml:space="preserve">Virieux, J., and Operto, S. (2009). An overview of full-waveform inversion in exploration geophysics. Geophysics, 74(6), WCC1-WCC26.</w:t>
-      </w:r>
-    </w:p>
-    <w:p>
-      <w:r>
-        <w:br w:type="page"/>
-      </w:r>
-    </w:p>
-    <w:p>
-      <w:pPr>
-        <w:pStyle w:val="Heading1"/>
-        <w:spacing w:after="120" w:before="300"/>
-      </w:pPr>
-      <w:r>
-        <w:rPr>
-          <w:rFonts w:ascii="Calibri" w:cs="Calibri" w:eastAsia="Calibri" w:hAnsi="Calibri"/>
-          <w:b/>
-          <w:bCs/>
-          <w:color w:val="1F3864"/>
-          <w:sz w:val="26"/>
-          <w:szCs w:val="26"/>
-        </w:rPr>
-        <w:t xml:space="preserve">Appendix A  Baseline validation</w:t>
-      </w:r>
-    </w:p>
-    <w:p>
-      <w:pPr>
-        <w:spacing w:after="60" w:before="60" w:line="300" w:lineRule="auto"/>
-        <w:jc w:val="left"/>
-      </w:pPr>
-      <w:r>
-        <w:rPr>
-          <w:rFonts w:ascii="Calibri" w:cs="Calibri" w:eastAsia="Calibri" w:hAnsi="Calibri"/>
-          <w:color w:val="111111"/>
-          <w:sz w:val="21"/>
-          <w:szCs w:val="21"/>
-        </w:rPr>
-        <w:t xml:space="preserve">The full-precision baseline against which every scheme is measured. Figure A1 shows the velocity model and acquisition and Figure A2 a shot record; Figure A3 gives the single- against double-precision difference that fixes the accuracy reference at about 9x10^-4 on the full model.</w:t>
+          <w:sz w:val="22"/>
+          <w:szCs w:val="22"/>
+        </w:rPr>
+        <w:t xml:space="preserve">5.6  Block shape</w:t>
       </w:r>
     </w:p>
     <w:p>
@@ -2792,7 +2408,7 @@
       <w:r>
         <w:drawing>
           <wp:inline distT="0" distB="0" distL="0" distR="0">
-            <wp:extent cx="3429000" cy="1428750"/>
+            <wp:extent cx="4095750" cy="1714500"/>
             <wp:effectExtent t="0" r="0" b="0" l="0"/>
             <wp:docPr id="1" name="" descr="" title=""/>
             <wp:cNvGraphicFramePr>
@@ -2817,7 +2433,7 @@
                   <pic:spPr bwMode="auto">
                     <a:xfrm>
                       <a:off x="0" y="0"/>
-                      <a:ext cx="3429000" cy="1428750"/>
+                      <a:ext cx="4095750" cy="1714500"/>
                     </a:xfrm>
                     <a:prstGeom prst="rect">
                       <a:avLst/>
@@ -2844,7 +2460,389 @@
           <w:sz w:val="17"/>
           <w:szCs w:val="17"/>
         </w:rPr>
-        <w:t xml:space="preserve">Figure A1. Marmousi velocity model with source and receiver positions.</w:t>
+        <w:t xml:space="preserve">Figure 8. Accuracy (left) and pack-and-unpack time (right) against block shape, at fixed size and bit cost. Aspect ratio one is a square block, higher is more strip-like.</w:t>
+      </w:r>
+    </w:p>
+    <w:p>
+      <w:pPr>
+        <w:spacing w:after="60" w:before="60" w:line="300" w:lineRule="auto"/>
+        <w:jc w:val="left"/>
+      </w:pPr>
+      <w:r>
+        <w:rPr>
+          <w:rFonts w:ascii="Calibri" w:cs="Calibri" w:eastAsia="Calibri" w:hAnsi="Calibri"/>
+          <w:b/>
+          <w:bCs/>
+          <w:color w:val="111111"/>
+          <w:sz w:val="21"/>
+          <w:szCs w:val="21"/>
+        </w:rPr>
+        <w:t xml:space="preserve">A block of thirty-two values was found to be more accurate than smaller blocks, which is the wrong way round if size alone mattered, and the cause is shape. </w:t>
+      </w:r>
+      <w:r>
+        <w:rPr>
+          <w:rFonts w:ascii="Calibri" w:cs="Calibri" w:eastAsia="Calibri" w:hAnsi="Calibri"/>
+          <w:b w:val="false"/>
+          <w:bCs w:val="false"/>
+          <w:color w:val="111111"/>
+          <w:sz w:val="21"/>
+          <w:szCs w:val="21"/>
+        </w:rPr>
+        <w:t xml:space="preserve">Holding the block size and bit cost fixed and varying only the shape, the memory-ordered strip gives 23.9 dB and a square block 28.5 dB, a gain of 4.6 dB at the same cost (Figure 8).</w:t>
+      </w:r>
+      <w:r>
+        <w:rPr>
+          <w:rFonts w:ascii="Calibri" w:cs="Calibri" w:eastAsia="Calibri" w:hAnsi="Calibri"/>
+          <w:b w:val="false"/>
+          <w:bCs w:val="false"/>
+          <w:color w:val="111111"/>
+          <w:sz w:val="21"/>
+          <w:szCs w:val="21"/>
+        </w:rPr>
+        <w:t xml:space="preserve"> A compact block draws its values from a small region where amplitudes are alike, so the shared exponent fits them better than it does across a strip that runs down the field through different arrivals. The square block needs a two-dimensional tiling to pack and unpack and so costs about 1.1 to 1.2 times the strip in that step, but the storage cost, and therefore the predicted speed-up, is identical, and in a bandwidth-bound solver the extra arithmetic is negligible. The lesson is that blocks should follow the geometry of the field, which points to cube-shaped blocks in three dimensions.</w:t>
+      </w:r>
+    </w:p>
+    <w:p>
+      <w:pPr>
+        <w:pStyle w:val="Heading1"/>
+        <w:spacing w:after="120" w:before="300"/>
+      </w:pPr>
+      <w:r>
+        <w:rPr>
+          <w:rFonts w:ascii="Calibri" w:cs="Calibri" w:eastAsia="Calibri" w:hAnsi="Calibri"/>
+          <w:b/>
+          <w:bCs/>
+          <w:color w:val="1F3864"/>
+          <w:sz w:val="26"/>
+          <w:szCs w:val="26"/>
+        </w:rPr>
+        <w:t xml:space="preserve">6  Discussion</w:t>
+      </w:r>
+    </w:p>
+    <w:p>
+      <w:pPr>
+        <w:spacing w:after="60" w:before="60" w:line="300" w:lineRule="auto"/>
+        <w:jc w:val="left"/>
+      </w:pPr>
+      <w:r>
+        <w:rPr>
+          <w:rFonts w:ascii="Calibri" w:cs="Calibri" w:eastAsia="Calibri" w:hAnsi="Calibri"/>
+          <w:color w:val="111111"/>
+          <w:sz w:val="21"/>
+          <w:szCs w:val="21"/>
+        </w:rPr>
+        <w:t xml:space="preserve">The results are consistent in showing that a per-block shared exponent uses each stored bit more effectively than the alternatives, and the comparison with int16 explains why. On paper int16, with fifteen mantissa bits, should beat the ten of half precision, yet it does not, because a single global fixed-point scale cannot span the wavefield's dynamic range: with the strong direct arrival a thousand times the weak reflections, a typical value keeps only about three bits of real precision, where floating point keeps ten everywhere. Restoring a scale per block lifts int16 above half precision and, as the block shrinks, into the microscaling range. int16 is thus the one-block limit of the same family, and microscaling is int16 given the local scales it was missing. Bit allocation, not bit count, is what determines accuracy, which is also why bfloat16, rich in range but poor in mantissa, does worst of all.</w:t>
+      </w:r>
+    </w:p>
+    <w:p>
+      <w:pPr>
+        <w:spacing w:after="60" w:before="60" w:line="300" w:lineRule="auto"/>
+        <w:jc w:val="left"/>
+      </w:pPr>
+      <w:r>
+        <w:rPr>
+          <w:rFonts w:ascii="Calibri" w:cs="Calibri" w:eastAsia="Calibri" w:hAnsi="Calibri"/>
+          <w:b/>
+          <w:bCs/>
+          <w:color w:val="111111"/>
+          <w:sz w:val="21"/>
+          <w:szCs w:val="21"/>
+        </w:rPr>
+        <w:t xml:space="preserve">The limitations fall into two kinds. </w:t>
+      </w:r>
+      <w:r>
+        <w:rPr>
+          <w:rFonts w:ascii="Calibri" w:cs="Calibri" w:eastAsia="Calibri" w:hAnsi="Calibri"/>
+          <w:b w:val="false"/>
+          <w:bCs w:val="false"/>
+          <w:color w:val="111111"/>
+          <w:sz w:val="21"/>
+          <w:szCs w:val="21"/>
+        </w:rPr>
+        <w:t xml:space="preserve">One is inherent to the method. The system-level speed-up is capped near twofold because only the wavefield is compressed while the model arrays are not, and error accumulation over time steps, shown in Section 5.4 to be the binding constraint, is a property of feeding a quantised field back into the solve rather than of the present implementation. The other kind is a limitation of this study, and could be lifted with more time. Efficiency is modelled rather than measured because the format is emulated; the quantiser is a simplified block floating-point rather than the exact OCP standard, so published guidance on safe bit widths would require that standard; and the experiments are two-dimensional and single-shot on cropped models. Two smaller questions were left open by the study: stochastic rounding did not improve on round-to-nearest, contrary to results for the parabolic heat equation (Croci and Giles, 2023), and the effect of quantising less frequently was not swept. The block-size anomaly, by contrast, is now explained as a shape effect.</w:t>
+      </w:r>
+    </w:p>
+    <w:p>
+      <w:pPr>
+        <w:pStyle w:val="Heading1"/>
+        <w:spacing w:after="120" w:before="300"/>
+      </w:pPr>
+      <w:r>
+        <w:rPr>
+          <w:rFonts w:ascii="Calibri" w:cs="Calibri" w:eastAsia="Calibri" w:hAnsi="Calibri"/>
+          <w:b/>
+          <w:bCs/>
+          <w:color w:val="1F3864"/>
+          <w:sz w:val="26"/>
+          <w:szCs w:val="26"/>
+        </w:rPr>
+        <w:t xml:space="preserve">7  Conclusions and future work</w:t>
+      </w:r>
+    </w:p>
+    <w:p>
+      <w:pPr>
+        <w:spacing w:after="60" w:before="60" w:line="300" w:lineRule="auto"/>
+        <w:jc w:val="left"/>
+      </w:pPr>
+      <w:r>
+        <w:rPr>
+          <w:rFonts w:ascii="Calibri" w:cs="Calibri" w:eastAsia="Calibri" w:hAnsi="Calibri"/>
+          <w:color w:val="111111"/>
+          <w:sz w:val="21"/>
+          <w:szCs w:val="21"/>
+        </w:rPr>
+        <w:t xml:space="preserve">The four objectives set out in Section 3 were all met. On the first, microscaling reached a higher signal-to-noise ratio than half precision at fewer bits per stored value, on both kernels: 47.8 dB against 41.7 dB at 14.25 bits on the acoustic kernel, and 46.7 dB, or 43.6 dB at only 13.25 bits, against 40.6 dB on the elastic kernel. On the second, that advantage survived a physical removal of the direct arrival: scored on the reflections alone microscaling reached about 43 dB at twelve mantissa bits, close to its whole-record figure and still clear of a 40 dB target, with the ranking of the schemes unchanged. On the third, the accuracy limit was shown to come from error accumulation over time steps rather than from the format's single-frame error, which a single compress-and-decompress preserves to about 78 dB while the full solve amplifies it a hundredfold or more. On the fourth, block shape was found to affect accuracy at fixed cost, a square block beating the memory-ordered strip by 4.6 dB, while adding only a 1.1 to 1.2 times pack-and-unpack overhead that is negligible in a bandwidth-bound solver.</w:t>
+      </w:r>
+    </w:p>
+    <w:p>
+      <w:pPr>
+        <w:spacing w:after="60" w:before="60" w:line="300" w:lineRule="auto"/>
+        <w:jc w:val="left"/>
+      </w:pPr>
+      <w:r>
+        <w:rPr>
+          <w:rFonts w:ascii="Calibri" w:cs="Calibri" w:eastAsia="Calibri" w:hAnsi="Calibri"/>
+          <w:color w:val="111111"/>
+          <w:sz w:val="21"/>
+          <w:szCs w:val="21"/>
+        </w:rPr>
+        <w:t xml:space="preserve">Taken together these establish microscaling storage as a practical means of reducing the memory traffic that governs solver speed, more accurate per stored bit than the half-precision baseline in current use, and understood well enough to say where its limit lies and how its blocks should be arranged.</w:t>
+      </w:r>
+    </w:p>
+    <w:p>
+      <w:pPr>
+        <w:spacing w:after="60" w:before="60" w:line="300" w:lineRule="auto"/>
+        <w:jc w:val="left"/>
+      </w:pPr>
+      <w:r>
+        <w:rPr>
+          <w:rFonts w:ascii="Calibri" w:cs="Calibri" w:eastAsia="Calibri" w:hAnsi="Calibri"/>
+          <w:color w:val="111111"/>
+          <w:sz w:val="21"/>
+          <w:szCs w:val="21"/>
+        </w:rPr>
+        <w:t xml:space="preserve">The immediate next step is to compress the static model arrays, which the efficiency model identifies as the largest available gain, and to move from the simplified quantiser to the exact OCP microscaling standard so that safe bit widths map to a published format. The block-shape result points to cube-shaped blocks in three dimensions, where the case is expected to strengthen: three-dimensional solvers are more strongly bandwidth- and capacity-bound, and large models often do not fit in device memory, so a format that moves fewer bytes helps more there, not less.</w:t>
+      </w:r>
+    </w:p>
+    <w:p>
+      <w:pPr>
+        <w:spacing w:after="60" w:before="60" w:line="300" w:lineRule="auto"/>
+        <w:jc w:val="left"/>
+      </w:pPr>
+      <w:r>
+        <w:rPr>
+          <w:rFonts w:ascii="Calibri" w:cs="Calibri" w:eastAsia="Calibri" w:hAnsi="Calibri"/>
+          <w:color w:val="111111"/>
+          <w:sz w:val="21"/>
+          <w:szCs w:val="21"/>
+        </w:rPr>
+        <w:t xml:space="preserve">Realising the predicted speed-up on hardware is the natural continuation, and the distinction between the present work and a hardware implementation is worth stating plainly. Here the format is emulated: the accuracy is exact and independent of the processor, while the efficiency is derived from memory traffic. A graphics-processor implementation would move the packing and unpacking into the compute kernel, so the wavefield genuinely occupies fewer bytes in device memory, and the speed-up would then be timed rather than modelled. The accuracy results carry over unchanged, since precision loss does not depend on hardware, and the bandwidth argument only strengthens on a processor that is more bandwidth-bound than the one used here. What a hardware run would add is the one thing the model cannot see, namely whether the packing and unpacking, once in a real kernel, stay cheap enough to preserve the saving; the timings measured here suggest they do.</w:t>
+      </w:r>
+    </w:p>
+    <w:p>
+      <w:pPr>
+        <w:pStyle w:val="Heading1"/>
+        <w:spacing w:after="120" w:before="300"/>
+      </w:pPr>
+      <w:r>
+        <w:rPr>
+          <w:rFonts w:ascii="Calibri" w:cs="Calibri" w:eastAsia="Calibri" w:hAnsi="Calibri"/>
+          <w:b/>
+          <w:bCs/>
+          <w:color w:val="1F3864"/>
+          <w:sz w:val="26"/>
+          <w:szCs w:val="26"/>
+        </w:rPr>
+        <w:t xml:space="preserve">Acknowledgements</w:t>
+      </w:r>
+    </w:p>
+    <w:p>
+      <w:pPr>
+        <w:spacing w:after="60" w:before="60" w:line="300" w:lineRule="auto"/>
+        <w:jc w:val="left"/>
+      </w:pPr>
+      <w:r>
+        <w:rPr>
+          <w:rFonts w:ascii="Calibri" w:cs="Calibri" w:eastAsia="Calibri" w:hAnsi="Calibri"/>
+          <w:color w:val="111111"/>
+          <w:sz w:val="21"/>
+          <w:szCs w:val="21"/>
+        </w:rPr>
+        <w:t xml:space="preserve">I thank Dr James Hobro of SLB for supervising this project and for guidance throughout, and SLB for proposing and sponsoring the work.</w:t>
+      </w:r>
+    </w:p>
+    <w:p>
+      <w:pPr>
+        <w:spacing w:after="60" w:before="60" w:line="300" w:lineRule="auto"/>
+        <w:jc w:val="left"/>
+      </w:pPr>
+      <w:r>
+        <w:rPr>
+          <w:rFonts w:ascii="Calibri" w:cs="Calibri" w:eastAsia="Calibri" w:hAnsi="Calibri"/>
+          <w:color w:val="111111"/>
+          <w:sz w:val="21"/>
+          <w:szCs w:val="21"/>
+        </w:rPr>
+        <w:t xml:space="preserve">Generative AI (Anthropic's Claude) was used as an assistant during the project. Its use covered drafting and refining code for the experiments, help with debugging, exploratory analysis of results, and language editing of this report. All experimental design, the interpretation of results, and the final content were reviewed and verified by the author, who takes full responsibility for the work.</w:t>
+      </w:r>
+    </w:p>
+    <w:p>
+      <w:pPr>
+        <w:pStyle w:val="Heading1"/>
+        <w:spacing w:after="120" w:before="300"/>
+      </w:pPr>
+      <w:r>
+        <w:rPr>
+          <w:rFonts w:ascii="Calibri" w:cs="Calibri" w:eastAsia="Calibri" w:hAnsi="Calibri"/>
+          <w:b/>
+          <w:bCs/>
+          <w:color w:val="1F3864"/>
+          <w:sz w:val="26"/>
+          <w:szCs w:val="26"/>
+        </w:rPr>
+        <w:t xml:space="preserve">References</w:t>
+      </w:r>
+    </w:p>
+    <w:p>
+      <w:pPr>
+        <w:spacing w:after="40" w:before="40" w:line="270" w:lineRule="auto"/>
+        <w:ind w:left="360" w:hanging="360"/>
+      </w:pPr>
+      <w:r>
+        <w:rPr>
+          <w:rFonts w:ascii="Calibri" w:cs="Calibri" w:eastAsia="Calibri" w:hAnsi="Calibri"/>
+          <w:color w:val="111111"/>
+          <w:sz w:val="19"/>
+          <w:szCs w:val="19"/>
+        </w:rPr>
+        <w:t xml:space="preserve">Croci, M., and Giles, M. B. (2023). Effects of round-to-nearest and stochastic rounding in the numerical solution of the heat equation in low precision. IMA Journal of Numerical Analysis, 43(3), 1358-1390.</w:t>
+      </w:r>
+    </w:p>
+    <w:p>
+      <w:pPr>
+        <w:spacing w:after="40" w:before="40" w:line="270" w:lineRule="auto"/>
+        <w:ind w:left="360" w:hanging="360"/>
+      </w:pPr>
+      <w:r>
+        <w:rPr>
+          <w:rFonts w:ascii="Calibri" w:cs="Calibri" w:eastAsia="Calibri" w:hAnsi="Calibri"/>
+          <w:color w:val="111111"/>
+          <w:sz w:val="19"/>
+          <w:szCs w:val="19"/>
+        </w:rPr>
+        <w:t xml:space="preserve">Fabien-Ouellet, G. (2020). Seismic modeling and inversion using half-precision floating-point numbers. Geophysics, 85(3), F65-F76.</w:t>
+      </w:r>
+    </w:p>
+    <w:p>
+      <w:pPr>
+        <w:spacing w:after="40" w:before="40" w:line="270" w:lineRule="auto"/>
+        <w:ind w:left="360" w:hanging="360"/>
+      </w:pPr>
+      <w:r>
+        <w:rPr>
+          <w:rFonts w:ascii="Calibri" w:cs="Calibri" w:eastAsia="Calibri" w:hAnsi="Calibri"/>
+          <w:color w:val="111111"/>
+          <w:sz w:val="19"/>
+          <w:szCs w:val="19"/>
+        </w:rPr>
+        <w:t xml:space="preserve">Lindstrom, P. (2014). Fixed-rate compressed floating-point arrays. IEEE Transactions on Visualization and Computer Graphics, 20(12), 2674-2683.</w:t>
+      </w:r>
+    </w:p>
+    <w:p>
+      <w:pPr>
+        <w:spacing w:after="40" w:before="40" w:line="270" w:lineRule="auto"/>
+        <w:ind w:left="360" w:hanging="360"/>
+      </w:pPr>
+      <w:r>
+        <w:rPr>
+          <w:rFonts w:ascii="Calibri" w:cs="Calibri" w:eastAsia="Calibri" w:hAnsi="Calibri"/>
+          <w:color w:val="111111"/>
+          <w:sz w:val="19"/>
+          <w:szCs w:val="19"/>
+        </w:rPr>
+        <w:t xml:space="preserve">Louboutin, M., Lange, M., Luporini, F., Kukreja, N., Witte, P. A., Herrmann, F. J., Velesko, P., and Gorman, G. J. (2019). Devito (v3.1.0): an embedded domain-specific language for finite differences and geophysical exploration. Geoscientific Model Development, 12(3), 1165-1187.</w:t>
+      </w:r>
+    </w:p>
+    <w:p>
+      <w:pPr>
+        <w:spacing w:after="40" w:before="40" w:line="270" w:lineRule="auto"/>
+        <w:ind w:left="360" w:hanging="360"/>
+      </w:pPr>
+      <w:r>
+        <w:rPr>
+          <w:rFonts w:ascii="Calibri" w:cs="Calibri" w:eastAsia="Calibri" w:hAnsi="Calibri"/>
+          <w:color w:val="111111"/>
+          <w:sz w:val="19"/>
+          <w:szCs w:val="19"/>
+        </w:rPr>
+        <w:t xml:space="preserve">Open Compute Project (2023). OCP Microscaling Formats (MX) Specification, Version 1.0.</w:t>
+      </w:r>
+    </w:p>
+    <w:p>
+      <w:pPr>
+        <w:spacing w:after="40" w:before="40" w:line="270" w:lineRule="auto"/>
+        <w:ind w:left="360" w:hanging="360"/>
+      </w:pPr>
+      <w:r>
+        <w:rPr>
+          <w:rFonts w:ascii="Calibri" w:cs="Calibri" w:eastAsia="Calibri" w:hAnsi="Calibri"/>
+          <w:color w:val="111111"/>
+          <w:sz w:val="19"/>
+          <w:szCs w:val="19"/>
+        </w:rPr>
+        <w:t xml:space="preserve">Versteeg, R. (1994). The Marmousi experience: velocity model determination on a synthetic complex data set. The Leading Edge, 13(9), 927-936.</w:t>
+      </w:r>
+    </w:p>
+    <w:p>
+      <w:pPr>
+        <w:spacing w:after="40" w:before="40" w:line="270" w:lineRule="auto"/>
+        <w:ind w:left="360" w:hanging="360"/>
+      </w:pPr>
+      <w:r>
+        <w:rPr>
+          <w:rFonts w:ascii="Calibri" w:cs="Calibri" w:eastAsia="Calibri" w:hAnsi="Calibri"/>
+          <w:color w:val="111111"/>
+          <w:sz w:val="19"/>
+          <w:szCs w:val="19"/>
+        </w:rPr>
+        <w:t xml:space="preserve">Virieux, J., and Operto, S. (2009). An overview of full-waveform inversion in exploration geophysics. Geophysics, 74(6), WCC1-WCC26.</w:t>
+      </w:r>
+    </w:p>
+    <w:p>
+      <w:r>
+        <w:br w:type="page"/>
+      </w:r>
+    </w:p>
+    <w:p>
+      <w:pPr>
+        <w:pStyle w:val="Heading1"/>
+        <w:spacing w:after="120" w:before="300"/>
+      </w:pPr>
+      <w:r>
+        <w:rPr>
+          <w:rFonts w:ascii="Calibri" w:cs="Calibri" w:eastAsia="Calibri" w:hAnsi="Calibri"/>
+          <w:b/>
+          <w:bCs/>
+          <w:color w:val="1F3864"/>
+          <w:sz w:val="26"/>
+          <w:szCs w:val="26"/>
+        </w:rPr>
+        <w:t xml:space="preserve">Appendix A  Baseline validation</w:t>
+      </w:r>
+    </w:p>
+    <w:p>
+      <w:pPr>
+        <w:spacing w:after="60" w:before="60" w:line="300" w:lineRule="auto"/>
+        <w:jc w:val="left"/>
+      </w:pPr>
+      <w:r>
+        <w:rPr>
+          <w:rFonts w:ascii="Calibri" w:cs="Calibri" w:eastAsia="Calibri" w:hAnsi="Calibri"/>
+          <w:color w:val="111111"/>
+          <w:sz w:val="21"/>
+          <w:szCs w:val="21"/>
+        </w:rPr>
+        <w:t xml:space="preserve">The full-precision baseline against which every scheme is measured. Figure A1 shows the velocity model and acquisition; Figure A2 gives the single- against double-precision difference that fixes the accuracy reference at about 9x10^-4 on the full model.</w:t>
       </w:r>
     </w:p>
     <w:p>
@@ -2855,7 +2853,7 @@
       <w:r>
         <w:drawing>
           <wp:inline distT="0" distB="0" distL="0" distR="0">
-            <wp:extent cx="3048000" cy="1905000"/>
+            <wp:extent cx="3429000" cy="1428750"/>
             <wp:effectExtent t="0" r="0" b="0" l="0"/>
             <wp:docPr id="1" name="" descr="" title=""/>
             <wp:cNvGraphicFramePr>
@@ -2880,7 +2878,7 @@
                   <pic:spPr bwMode="auto">
                     <a:xfrm>
                       <a:off x="0" y="0"/>
-                      <a:ext cx="3048000" cy="1905000"/>
+                      <a:ext cx="3429000" cy="1428750"/>
                     </a:xfrm>
                     <a:prstGeom prst="rect">
                       <a:avLst/>
@@ -2907,7 +2905,7 @@
           <w:sz w:val="17"/>
           <w:szCs w:val="17"/>
         </w:rPr>
-        <w:t xml:space="preserve">Figure A2. Full-precision shot record.</w:t>
+        <w:t xml:space="preserve">Figure A1. Marmousi velocity model with source and receiver positions.</w:t>
       </w:r>
     </w:p>
     <w:p>
@@ -2970,7 +2968,7 @@
           <w:sz w:val="17"/>
           <w:szCs w:val="17"/>
         </w:rPr>
-        <w:t xml:space="preserve">Figure A3. Single- against double-precision difference, which sets the accuracy reference.</w:t>
+        <w:t xml:space="preserve">Figure A2. Single- against double-precision difference, which sets the accuracy reference.</w:t>
       </w:r>
     </w:p>
     <w:p>
@@ -3002,7 +3000,7 @@
           <w:sz w:val="21"/>
           <w:szCs w:val="21"/>
         </w:rPr>
-        <w:t xml:space="preserve">Figure B1 shows how the wavefield error builds up over the solve, the growth behind the accumulation argument of Section 5.4. Figure B2 shows the water-model subtraction that isolates the reflections scored in Section 5.5: the full record, the water model that carries only the direct arrival, and their time-scaled difference. Figure B3 is the int16 diagnostic of Section 6, where giving int16 a scale per block drops its error below half precision and converges towards microscaling as the block shrinks.</w:t>
+        <w:t xml:space="preserve">Figure B1 shows how the wavefield error builds up over the solve, the growth behind the accumulation argument of Section 5.4. Figure B2 is the int16 diagnostic of Section 6, where giving int16 a scale per block drops its error below half precision and converges towards microscaling as the block shrinks.</w:t>
       </w:r>
     </w:p>
     <w:p>
@@ -3076,7 +3074,7 @@
       <w:r>
         <w:drawing>
           <wp:inline distT="0" distB="0" distL="0" distR="0">
-            <wp:extent cx="4095750" cy="2238375"/>
+            <wp:extent cx="3429000" cy="2181225"/>
             <wp:effectExtent t="0" r="0" b="0" l="0"/>
             <wp:docPr id="1" name="" descr="" title=""/>
             <wp:cNvGraphicFramePr>
@@ -3101,7 +3099,7 @@
                   <pic:spPr bwMode="auto">
                     <a:xfrm>
                       <a:off x="0" y="0"/>
-                      <a:ext cx="4095750" cy="2238375"/>
+                      <a:ext cx="3429000" cy="2181225"/>
                     </a:xfrm>
                     <a:prstGeom prst="rect">
                       <a:avLst/>
@@ -3128,7 +3126,39 @@
           <w:sz w:val="17"/>
           <w:szCs w:val="17"/>
         </w:rPr>
-        <w:t xml:space="preserve">Figure B2. Full record, water model (direct arrival only), and their time-scaled difference (the reflections).</w:t>
+        <w:t xml:space="preserve">Figure B2. int16 error as the number of independent scales increases; per-block scaling converges to microscaling.</w:t>
+      </w:r>
+    </w:p>
+    <w:p>
+      <w:pPr>
+        <w:pStyle w:val="Heading1"/>
+        <w:spacing w:after="120" w:before="300"/>
+      </w:pPr>
+      <w:r>
+        <w:rPr>
+          <w:rFonts w:ascii="Calibri" w:cs="Calibri" w:eastAsia="Calibri" w:hAnsi="Calibri"/>
+          <w:b/>
+          <w:bCs/>
+          <w:color w:val="1F3864"/>
+          <w:sz w:val="26"/>
+          <w:szCs w:val="26"/>
+        </w:rPr>
+        <w:t xml:space="preserve">Appendix C  Half-precision arithmetic</w:t>
+      </w:r>
+    </w:p>
+    <w:p>
+      <w:pPr>
+        <w:spacing w:after="60" w:before="60" w:line="300" w:lineRule="auto"/>
+        <w:jc w:val="left"/>
+      </w:pPr>
+      <w:r>
+        <w:rPr>
+          <w:rFonts w:ascii="Calibri" w:cs="Calibri" w:eastAsia="Calibri" w:hAnsi="Calibri"/>
+          <w:color w:val="111111"/>
+          <w:sz w:val="21"/>
+          <w:szCs w:val="21"/>
+        </w:rPr>
+        <w:t xml:space="preserve">Because Devito cannot build a half-precision grid, the half-precision-arithmetic method of Fabien-Ouellet was reproduced in a self-contained stepper (Figure C1), which reproduces the reported behaviour and confirms the baseline the elastic comparison scores against. Table C1 gives the elastic-kernel figures in full.</w:t>
       </w:r>
     </w:p>
     <w:p>
@@ -3139,7 +3169,7 @@
       <w:r>
         <w:drawing>
           <wp:inline distT="0" distB="0" distL="0" distR="0">
-            <wp:extent cx="3429000" cy="2181225"/>
+            <wp:extent cx="3143250" cy="2000250"/>
             <wp:effectExtent t="0" r="0" b="0" l="0"/>
             <wp:docPr id="1" name="" descr="" title=""/>
             <wp:cNvGraphicFramePr>
@@ -3164,101 +3194,6 @@
                   <pic:spPr bwMode="auto">
                     <a:xfrm>
                       <a:off x="0" y="0"/>
-                      <a:ext cx="3429000" cy="2181225"/>
-                    </a:xfrm>
-                    <a:prstGeom prst="rect">
-                      <a:avLst/>
-                    </a:prstGeom>
-                  </pic:spPr>
-                </pic:pic>
-              </a:graphicData>
-            </a:graphic>
-          </wp:inline>
-        </w:drawing>
-      </w:r>
-    </w:p>
-    <w:p>
-      <w:pPr>
-        <w:spacing w:after="150" w:before="0"/>
-        <w:jc w:val="left"/>
-      </w:pPr>
-      <w:r>
-        <w:rPr>
-          <w:rFonts w:ascii="Calibri" w:cs="Calibri" w:eastAsia="Calibri" w:hAnsi="Calibri"/>
-          <w:i/>
-          <w:iCs/>
-          <w:color w:val="595959"/>
-          <w:sz w:val="17"/>
-          <w:szCs w:val="17"/>
-        </w:rPr>
-        <w:t xml:space="preserve">Figure B3. int16 error as the number of independent scales increases; per-block scaling converges to microscaling.</w:t>
-      </w:r>
-    </w:p>
-    <w:p>
-      <w:pPr>
-        <w:pStyle w:val="Heading1"/>
-        <w:spacing w:after="120" w:before="300"/>
-      </w:pPr>
-      <w:r>
-        <w:rPr>
-          <w:rFonts w:ascii="Calibri" w:cs="Calibri" w:eastAsia="Calibri" w:hAnsi="Calibri"/>
-          <w:b/>
-          <w:bCs/>
-          <w:color w:val="1F3864"/>
-          <w:sz w:val="26"/>
-          <w:szCs w:val="26"/>
-        </w:rPr>
-        <w:t xml:space="preserve">Appendix C  Half-precision arithmetic and hybrid</w:t>
-      </w:r>
-    </w:p>
-    <w:p>
-      <w:pPr>
-        <w:spacing w:after="60" w:before="60" w:line="300" w:lineRule="auto"/>
-        <w:jc w:val="left"/>
-      </w:pPr>
-      <w:r>
-        <w:rPr>
-          <w:rFonts w:ascii="Calibri" w:cs="Calibri" w:eastAsia="Calibri" w:hAnsi="Calibri"/>
-          <w:color w:val="111111"/>
-          <w:sz w:val="21"/>
-          <w:szCs w:val="21"/>
-        </w:rPr>
-        <w:t xml:space="preserve">Because Devito cannot build a half-precision grid, the half-precision-arithmetic method of Fabien-Ouellet was reproduced in a self-contained stepper (Figure C1). Figure C2 combines half-precision arithmetic with microscaling storage; the errors do not compound, since the two act on different resources, and the hybrid sits near the half-precision floor. Table C1 gives the elastic-kernel figures in full.</w:t>
-      </w:r>
-    </w:p>
-    <w:p>
-      <w:pPr>
-        <w:spacing w:after="40" w:before="120"/>
-        <w:jc w:val="center"/>
-      </w:pPr>
-      <w:r>
-        <w:drawing>
-          <wp:inline distT="0" distB="0" distL="0" distR="0">
-            <wp:extent cx="3143250" cy="2000250"/>
-            <wp:effectExtent t="0" r="0" b="0" l="0"/>
-            <wp:docPr id="1" name="" descr="" title=""/>
-            <wp:cNvGraphicFramePr>
-              <a:graphicFrameLocks xmlns:a="http://schemas.openxmlformats.org/drawingml/2006/main" noChangeAspect="1"/>
-            </wp:cNvGraphicFramePr>
-            <a:graphic xmlns:a="http://schemas.openxmlformats.org/drawingml/2006/main">
-              <a:graphicData uri="http://schemas.openxmlformats.org/drawingml/2006/picture">
-                <pic:pic xmlns:pic="http://schemas.openxmlformats.org/drawingml/2006/picture">
-                  <pic:nvPicPr>
-                    <pic:cNvPr id="0" name="" descr=""/>
-                    <pic:cNvPicPr>
-                      <a:picLocks noChangeAspect="1" noChangeArrowheads="1"/>
-                    </pic:cNvPicPr>
-                  </pic:nvPicPr>
-                  <pic:blipFill>
-                    <a:blip r:embed="rId23" cstate="none"/>
-                    <a:srcRect/>
-                    <a:stretch>
-                      <a:fillRect/>
-                    </a:stretch>
-                  </pic:blipFill>
-                  <pic:spPr bwMode="auto">
-                    <a:xfrm>
-                      <a:off x="0" y="0"/>
                       <a:ext cx="3143250" cy="2000250"/>
                     </a:xfrm>
                     <a:prstGeom prst="rect">
@@ -3287,69 +3222,6 @@
           <w:szCs w:val="17"/>
         </w:rPr>
         <w:t xml:space="preserve">Figure C1. Reproduction of half-precision arithmetic in a self-contained stepper.</w:t>
-      </w:r>
-    </w:p>
-    <w:p>
-      <w:pPr>
-        <w:spacing w:after="40" w:before="120"/>
-        <w:jc w:val="center"/>
-      </w:pPr>
-      <w:r>
-        <w:drawing>
-          <wp:inline distT="0" distB="0" distL="0" distR="0">
-            <wp:extent cx="3143250" cy="2000250"/>
-            <wp:effectExtent t="0" r="0" b="0" l="0"/>
-            <wp:docPr id="1" name="" descr="" title=""/>
-            <wp:cNvGraphicFramePr>
-              <a:graphicFrameLocks xmlns:a="http://schemas.openxmlformats.org/drawingml/2006/main" noChangeAspect="1"/>
-            </wp:cNvGraphicFramePr>
-            <a:graphic xmlns:a="http://schemas.openxmlformats.org/drawingml/2006/main">
-              <a:graphicData uri="http://schemas.openxmlformats.org/drawingml/2006/picture">
-                <pic:pic xmlns:pic="http://schemas.openxmlformats.org/drawingml/2006/picture">
-                  <pic:nvPicPr>
-                    <pic:cNvPr id="0" name="" descr=""/>
-                    <pic:cNvPicPr>
-                      <a:picLocks noChangeAspect="1" noChangeArrowheads="1"/>
-                    </pic:cNvPicPr>
-                  </pic:nvPicPr>
-                  <pic:blipFill>
-                    <a:blip r:embed="rId24" cstate="none"/>
-                    <a:srcRect/>
-                    <a:stretch>
-                      <a:fillRect/>
-                    </a:stretch>
-                  </pic:blipFill>
-                  <pic:spPr bwMode="auto">
-                    <a:xfrm>
-                      <a:off x="0" y="0"/>
-                      <a:ext cx="3143250" cy="2000250"/>
-                    </a:xfrm>
-                    <a:prstGeom prst="rect">
-                      <a:avLst/>
-                    </a:prstGeom>
-                  </pic:spPr>
-                </pic:pic>
-              </a:graphicData>
-            </a:graphic>
-          </wp:inline>
-        </w:drawing>
-      </w:r>
-    </w:p>
-    <w:p>
-      <w:pPr>
-        <w:spacing w:after="150" w:before="0"/>
-        <w:jc w:val="left"/>
-      </w:pPr>
-      <w:r>
-        <w:rPr>
-          <w:rFonts w:ascii="Calibri" w:cs="Calibri" w:eastAsia="Calibri" w:hAnsi="Calibri"/>
-          <w:i/>
-          <w:iCs/>
-          <w:color w:val="595959"/>
-          <w:sz w:val="17"/>
-          <w:szCs w:val="17"/>
-        </w:rPr>
-        <w:t xml:space="preserve">Figure C2. Half-precision arithmetic combined with microscaling storage.</w:t>
       </w:r>
     </w:p>
     <w:p>
@@ -3588,7 +3460,7 @@
                 <w:sz w:val="18"/>
                 <w:szCs w:val="18"/>
               </w:rPr>
-              <w:t xml:space="preserve">54.9</w:t>
+              <w:t xml:space="preserve">40.2</w:t>
             </w:r>
           </w:p>
         </w:tc>
@@ -3617,7 +3489,7 @@
                 <w:sz w:val="18"/>
                 <w:szCs w:val="18"/>
               </w:rPr>
-              <w:t xml:space="preserve">1.8x10^-3</w:t>
+              <w:t xml:space="preserve">9.7x10^-3</w:t>
             </w:r>
           </w:p>
         </w:tc>
@@ -3706,7 +3578,7 @@
                 <w:sz w:val="18"/>
                 <w:szCs w:val="18"/>
               </w:rPr>
-              <w:t xml:space="preserve">55.2</w:t>
+              <w:t xml:space="preserve">40.6</w:t>
             </w:r>
           </w:p>
         </w:tc>
@@ -3735,7 +3607,7 @@
                 <w:sz w:val="18"/>
                 <w:szCs w:val="18"/>
               </w:rPr>
-              <w:t xml:space="preserve">1.7x10^-3</w:t>
+              <w:t xml:space="preserve">9.3x10^-3</w:t>
             </w:r>
           </w:p>
         </w:tc>
@@ -3824,7 +3696,7 @@
                 <w:sz w:val="18"/>
                 <w:szCs w:val="18"/>
               </w:rPr>
-              <w:t xml:space="preserve">53.6</w:t>
+              <w:t xml:space="preserve">40.1</w:t>
             </w:r>
           </w:p>
         </w:tc>
@@ -3853,7 +3725,7 @@
                 <w:sz w:val="18"/>
                 <w:szCs w:val="18"/>
               </w:rPr>
-              <w:t xml:space="preserve">2.1x10^-3</w:t>
+              <w:t xml:space="preserve">9.9x10^-3</w:t>
             </w:r>
           </w:p>
         </w:tc>
@@ -3942,7 +3814,7 @@
                 <w:sz w:val="18"/>
                 <w:szCs w:val="18"/>
               </w:rPr>
-              <w:t xml:space="preserve">57.5</w:t>
+              <w:t xml:space="preserve">43.6</w:t>
             </w:r>
           </w:p>
         </w:tc>
@@ -3971,7 +3843,7 @@
                 <w:sz w:val="18"/>
                 <w:szCs w:val="18"/>
               </w:rPr>
-              <w:t xml:space="preserve">1.3x10^-3</w:t>
+              <w:t xml:space="preserve">6.6x10^-3</w:t>
             </w:r>
           </w:p>
         </w:tc>
@@ -4060,7 +3932,7 @@
                 <w:sz w:val="18"/>
                 <w:szCs w:val="18"/>
               </w:rPr>
-              <w:t xml:space="preserve">61.2</w:t>
+              <w:t xml:space="preserve">46.7</w:t>
             </w:r>
           </w:p>
         </w:tc>
@@ -4089,7 +3961,7 @@
                 <w:sz w:val="18"/>
                 <w:szCs w:val="18"/>
               </w:rPr>
-              <w:t xml:space="preserve">8.7x10^-4</w:t>
+              <w:t xml:space="preserve">4.6x10^-3</w:t>
             </w:r>
           </w:p>
         </w:tc>
@@ -4178,7 +4050,7 @@
                 <w:sz w:val="18"/>
                 <w:szCs w:val="18"/>
               </w:rPr>
-              <w:t xml:space="preserve">76.9</w:t>
+              <w:t xml:space="preserve">63.0</w:t>
             </w:r>
           </w:p>
         </w:tc>
@@ -4207,7 +4079,7 @@
                 <w:sz w:val="18"/>
                 <w:szCs w:val="18"/>
               </w:rPr>
-              <w:t xml:space="preserve">1.4x10^-4</w:t>
+              <w:t xml:space="preserve">7.1x10^-4</w:t>
             </w:r>
           </w:p>
         </w:tc>

</xml_diff>

<commit_message>
final report draft v5
</commit_message>
<xml_diff>
--- a/MX_Final_Report.docx
+++ b/MX_Final_Report.docx
@@ -636,7 +636,7 @@
           <w:sz w:val="21"/>
           <w:szCs w:val="21"/>
         </w:rPr>
-        <w:t xml:space="preserve">A reference point frames the scale: single precision itself departs from double precision by about 9x10^-4 on the full model. Section 5.5 gives a second, independent check on the same concern, removing the direct arrival physically with a water model rather than down-weighting it.</w:t>
+        <w:t xml:space="preserve">A reference point frames the scale: single precision itself departs from double precision by about 9x10^-4 on the full model. Section 5.5 reports a complementary measure that removes the direct arrival outright with a water model, rather than down-weighting it.</w:t>
       </w:r>
     </w:p>
     <w:p>
@@ -1772,7 +1772,7 @@
           <w:sz w:val="17"/>
           <w:szCs w:val="17"/>
         </w:rPr>
-        <w:t xml:space="preserve">Figure 2. Time-scaled differences, two ways. (a) Each scheme's receiver gather minus the full-precision reference, on one common scale, so a larger residual is a worse scheme: bfloat16 leaves the most, microscaling the least. (b) The full record, the water model that carries only the direct arrival, and their difference, which is the reflections; the water subtraction of Section 5.5 isolates the same weak energy that the time gain in (a) brings out.</w:t>
+        <w:t xml:space="preserve">Figure 2. Time-scaled differences, two ways. (a) Each scheme's receiver gather minus the full-precision reference, on one common scale, so a larger residual is a worse scheme: bfloat16 leaves the most, microscaling the least. (b) The full record, the water model that carries only the direct arrival, and their difference, which is the reflections: the weak energy that the time gain in (a) brings out and that Section 5.5 scores directly.</w:t>
       </w:r>
     </w:p>
     <w:p>
@@ -2263,7 +2263,7 @@
           <w:sz w:val="22"/>
           <w:szCs w:val="22"/>
         </w:rPr>
-        <w:t xml:space="preserve">5.5  A second check: scoring the reflections directly</w:t>
+        <w:t xml:space="preserve">5.5  Scoring the reflections directly</w:t>
       </w:r>
     </w:p>
     <w:p>
@@ -2341,7 +2341,7 @@
           <w:sz w:val="21"/>
           <w:szCs w:val="21"/>
         </w:rPr>
-        <w:t xml:space="preserve">The time-scaled metric down-weights the strong direct arrival, but it does not remove it, so it is worth confirming the result with a method that removes it outright. A second model that is water everywhere at the surface velocity was run with the source, geometry and time-stepping held identical and only the velocity changed. With no contrasts it produces the direct arrival alone, and subtracting it isolates the reflections; the microscaling run is put through the water model too, so the arrival removed is the one it produced.</w:t>
+        <w:t xml:space="preserve">Time-scaling weights the arrivals evenly but does not remove the direct arrival, which any format reproduces easily. A stricter measure scores the reflections alone, isolated with a water model: a second model that is water everywhere at the surface velocity, run with the source, geometry and time-stepping held identical and only the velocity changed, produces the direct arrival by itself, and subtracting it leaves the reflections. The microscaling run is put through the water model as well, so the arrival removed is the one it produced.</w:t>
       </w:r>
     </w:p>
     <w:p>
@@ -2349,6 +2349,17 @@
         <w:spacing w:after="60" w:before="60" w:line="300" w:lineRule="auto"/>
         <w:jc w:val="left"/>
       </w:pPr>
+      <w:r>
+        <w:rPr>
+          <w:rFonts w:ascii="Calibri" w:cs="Calibri" w:eastAsia="Calibri" w:hAnsi="Calibri"/>
+          <w:b w:val="false"/>
+          <w:bCs w:val="false"/>
+          <w:color w:val="111111"/>
+          <w:sz w:val="21"/>
+          <w:szCs w:val="21"/>
+        </w:rPr>
+        <w:t xml:space="preserve">The reflections carry about 45 percent of the record's energy. </w:t>
+      </w:r>
       <w:r>
         <w:rPr>
           <w:rFonts w:ascii="Calibri" w:cs="Calibri" w:eastAsia="Calibri" w:hAnsi="Calibri"/>
@@ -2358,18 +2369,7 @@
           <w:sz w:val="21"/>
           <w:szCs w:val="21"/>
         </w:rPr>
-        <w:t xml:space="preserve">The two routes agree. </w:t>
-      </w:r>
-      <w:r>
-        <w:rPr>
-          <w:rFonts w:ascii="Calibri" w:cs="Calibri" w:eastAsia="Calibri" w:hAnsi="Calibri"/>
-          <w:b/>
-          <w:bCs/>
-          <w:color w:val="111111"/>
-          <w:sz w:val="21"/>
-          <w:szCs w:val="21"/>
-        </w:rPr>
-        <w:t xml:space="preserve">On this model the reflections carry about 45 percent of the record's energy, and scored on them alone microscaling reaches 43 dB at twelve mantissa bits, close to its 48 dB time-scaled whole-record figure and still clear of a 40 dB target. The gap between the two measures is about five decibels and holds across bit widths, and the ranking of the schemes does not change</w:t>
+        <w:t xml:space="preserve">Scored on them alone, microscaling reaches 43 dB at twelve mantissa bits, about five decibels below its whole-record figure of 48 dB but still clear of a 40 dB target, and the gap holds across bit widths with the ranking of the schemes unchanged</w:t>
       </w:r>
       <w:r>
         <w:rPr>
@@ -2380,7 +2380,7 @@
           <w:sz w:val="21"/>
           <w:szCs w:val="21"/>
         </w:rPr>
-        <w:t xml:space="preserve">. Removing the direct arrival physically and down-weighting it by time-scaling give the same verdict, which is the point: microscaling's advantage does not depend on the strong arrival that any format reproduces easily.</w:t>
+        <w:t xml:space="preserve">. Its advantage therefore does not rest on the strong direct arrival, but holds on the weak reflected energy the image is built from.</w:t>
       </w:r>
     </w:p>
     <w:p>
@@ -2559,7 +2559,7 @@
           <w:sz w:val="21"/>
           <w:szCs w:val="21"/>
         </w:rPr>
-        <w:t xml:space="preserve">One is inherent to the method. The system-level speed-up is capped near twofold because only the wavefield is compressed while the model arrays are not, and error accumulation over time steps, shown in Section 5.4 to be the binding constraint, is a property of feeding a quantised field back into the solve rather than of the present implementation. The other kind is a limitation of this study, and could be lifted with more time. Efficiency is modelled rather than measured because the format is emulated; the quantiser is a simplified block floating-point rather than the exact OCP standard, so published guidance on safe bit widths would require that standard; and the experiments are two-dimensional and single-shot on cropped models. Two smaller questions were left open by the study: stochastic rounding did not improve on round-to-nearest, contrary to results for the parabolic heat equation (Croci and Giles, 2023), and the effect of quantising less frequently was not swept. The block-size anomaly, by contrast, is now explained as a shape effect.</w:t>
+        <w:t xml:space="preserve">One is inherent to the method. The system-level speed-up is capped near twofold because only the wavefield is compressed while the model arrays are not, and error accumulation over time steps, shown in Section 5.4 to be the binding constraint, is a property of feeding a quantised field back into the solve rather than of the present implementation. The other kind is a limitation of this study, and could be lifted with more time. Efficiency is modelled rather than measured because the format is emulated; the quantiser is a simplified block floating-point rather than the exact OCP standard, so published guidance on safe bit widths would require that standard; and the experiments are two-dimensional and single-shot on cropped models. Two smaller questions were left open by the study: stochastic rounding did not improve on round-to-nearest, contrary to results for the parabolic heat equation (Croci and Giles, 2023), and the effect of quantising less frequently was not swept. The block-size behaviour is a shape effect (Section 5.6).</w:t>
       </w:r>
     </w:p>
     <w:p>

</xml_diff>

<commit_message>
final report draft v7
</commit_message>
<xml_diff>
--- a/MX_Final_Report.docx
+++ b/MX_Final_Report.docx
@@ -542,7 +542,7 @@
           <w:sz w:val="21"/>
           <w:szCs w:val="21"/>
         </w:rPr>
-        <w:t xml:space="preserve">A value is stored by grouping the wavefield into blocks of thirty-two and giving each block one shared exponent while each value keeps its own mantissa. The shared factor is a power of two, held as an eight-bit exponent and set from the largest magnitude in the block, so applying and removing it introduces no rounding of its own. Each value then stores a sign bit and a magnitude. Because the whole block shares one exponent, only values near the top of the block's range normalise into the interval from one to two; every smaller value falls below one, with a leading zero. That leading bit cannot be left implicit the way ordinary floating point does, where each number carries its own exponent and always normalises into one to two, so here it is stored explicitly. The cost per value is thus the mantissa width plus two, the mantissa together with this integer bit and the sign, plus the block's share of the exponent, eight divided by the block size; at twelve mantissa bits and a block of thirty-two this is 14.25 bits, against the flat sixteen of half precision. The implementation is a simplified block floating-point rather than the exact OCP microscaling standard, which assigns each element its own micro-exponent; the distinction is returned to in the discussion.</w:t>
+        <w:t xml:space="preserve">A value is stored by grouping the wavefield into blocks of thirty-two and giving each block one shared exponent while each value keeps its own mantissa. The shared factor is a power of two, held as an eight-bit exponent and set from the largest magnitude in the block, so applying and removing it introduces no rounding of its own. Each value then stores a sign bit and a magnitude. Because the whole block shares one exponent, only values near the top of the block's range normalise into the interval from one to two; every smaller value falls below one, with a leading zero. That leading bit cannot be left implicit the way ordinary floating point does, where each number carries its own exponent and always normalises into one to two, so here it is stored explicitly. The cost per value is thus the mantissa width plus two, the mantissa together with this integer bit and the sign, plus the block's share of the exponent, eight divided by the block size; at twelve mantissa bits and a block of thirty-two this is 14.25 bits, against the flat sixteen of half precision. The implementation is a simplified block floating-point rather than the exact OCP microscaling standard (Open Compute Project, 2023), which assigns each element its own micro-exponent; the distinction is returned to in the discussion.</w:t>
       </w:r>
     </w:p>
     <w:p>
@@ -780,7 +780,7 @@
           <w:sz w:val="21"/>
           <w:szCs w:val="21"/>
         </w:rPr>
-        <w:t xml:space="preserve">Every format was reimplemented in one harness and run on the same model with the same metric, so the comparison does not rest on numbers drawn from different studies. </w:t>
+        <w:t xml:space="preserve">Every format was reimplemented in one harness and run on the same model with the same metric, so the comparison does not rest on numbers drawn from different studies (Figure 1). </w:t>
       </w:r>
       <w:r>
         <w:rPr>
@@ -1867,7 +1867,7 @@
           <w:sz w:val="21"/>
           <w:szCs w:val="21"/>
         </w:rPr>
-        <w:t xml:space="preserve">The closeness is visible in the wavefield itself, not only in the recorded traces. </w:t>
+        <w:t xml:space="preserve">The closeness is visible in the wavefield itself, not only in the recorded traces (Figure 3). </w:t>
       </w:r>
       <w:r>
         <w:rPr>
@@ -1986,7 +1986,7 @@
           <w:sz w:val="21"/>
           <w:szCs w:val="21"/>
         </w:rPr>
-        <w:t xml:space="preserve">At matched accuracy the bandwidth model gives microscaling a predicted speed-up of about 1.6 times, against 1.5 for half precision. </w:t>
+        <w:t xml:space="preserve">At matched accuracy the bandwidth model gives microscaling a predicted speed-up of about 1.6 times, against 1.5 for half precision (Figure 4). </w:t>
       </w:r>
       <w:r>
         <w:rPr>
@@ -2105,7 +2105,7 @@
           <w:sz w:val="21"/>
           <w:szCs w:val="21"/>
         </w:rPr>
-        <w:t xml:space="preserve">On the elastic kernel, the setting half-precision scaling was designed for, microscaling again reaches better accuracy at fewer bits. </w:t>
+        <w:t xml:space="preserve">On the elastic kernel, the setting half-precision scaling was designed for, microscaling again reaches better accuracy at fewer bits (Figure 5). </w:t>
       </w:r>
       <w:r>
         <w:rPr>
@@ -2358,7 +2358,7 @@
           <w:sz w:val="21"/>
           <w:szCs w:val="21"/>
         </w:rPr>
-        <w:t xml:space="preserve">The reflections carry about 45 percent of the record's energy. </w:t>
+        <w:t xml:space="preserve">The reflections carry about 45 percent of the record's energy (Figure 7). </w:t>
       </w:r>
       <w:r>
         <w:rPr>

</xml_diff>